<commit_message>
Updated Progress document and modified server.js,db.js
</commit_message>
<xml_diff>
--- a/docs/Progress.docx
+++ b/docs/Progress.docx
@@ -281,8 +281,13 @@
         </w:numPr>
         <w:spacing w:after="0"/>
       </w:pPr>
-      <w:r>
-        <w:t>Install it on your computer.</w:t>
+      <w:proofErr w:type="gramStart"/>
+      <w:r>
+        <w:t>Install</w:t>
+      </w:r>
+      <w:proofErr w:type="gramEnd"/>
+      <w:r>
+        <w:t xml:space="preserve"> it on your computer.</w:t>
       </w:r>
     </w:p>
     <w:p>
@@ -325,16 +330,29 @@
       <w:pPr>
         <w:spacing w:after="0"/>
       </w:pPr>
-      <w:r>
-        <w:t>npm -v</w:t>
-      </w:r>
-    </w:p>
-    <w:p>
-      <w:pPr>
-        <w:spacing w:after="0"/>
-      </w:pPr>
-      <w:r>
-        <w:t>You should see version numbers for Node.js and npm (Node Package Manager).</w:t>
+      <w:proofErr w:type="spellStart"/>
+      <w:r>
+        <w:t>npm</w:t>
+      </w:r>
+      <w:proofErr w:type="spellEnd"/>
+      <w:r>
+        <w:t xml:space="preserve"> -v</w:t>
+      </w:r>
+    </w:p>
+    <w:p>
+      <w:pPr>
+        <w:spacing w:after="0"/>
+      </w:pPr>
+      <w:r>
+        <w:t xml:space="preserve">You should see version numbers for Node.js and </w:t>
+      </w:r>
+      <w:proofErr w:type="spellStart"/>
+      <w:r>
+        <w:t>npm</w:t>
+      </w:r>
+      <w:proofErr w:type="spellEnd"/>
+      <w:r>
+        <w:t xml:space="preserve"> (Node Package Manager).</w:t>
       </w:r>
     </w:p>
     <w:p>
@@ -1014,16 +1032,37 @@
       <w:pPr>
         <w:spacing w:after="0"/>
       </w:pPr>
-      <w:r>
-        <w:t>npm init -y</w:t>
-      </w:r>
-    </w:p>
-    <w:p>
-      <w:pPr>
-        <w:spacing w:after="0"/>
-      </w:pPr>
-      <w:r>
-        <w:t>This creates a package.json file, which will track your project’s dependencies.</w:t>
+      <w:proofErr w:type="spellStart"/>
+      <w:r>
+        <w:t>npm</w:t>
+      </w:r>
+      <w:proofErr w:type="spellEnd"/>
+      <w:r>
+        <w:t xml:space="preserve"> </w:t>
+      </w:r>
+      <w:proofErr w:type="spellStart"/>
+      <w:r>
+        <w:t>init</w:t>
+      </w:r>
+      <w:proofErr w:type="spellEnd"/>
+      <w:r>
+        <w:t xml:space="preserve"> -y</w:t>
+      </w:r>
+    </w:p>
+    <w:p>
+      <w:pPr>
+        <w:spacing w:after="0"/>
+      </w:pPr>
+      <w:r>
+        <w:t>This creates a </w:t>
+      </w:r>
+      <w:proofErr w:type="spellStart"/>
+      <w:r>
+        <w:t>package.json</w:t>
+      </w:r>
+      <w:proofErr w:type="spellEnd"/>
+      <w:r>
+        <w:t> file, which will track your project’s dependencies.</w:t>
       </w:r>
     </w:p>
     <w:p>
@@ -1122,8 +1161,13 @@
       <w:pPr>
         <w:spacing w:after="0"/>
       </w:pPr>
-      <w:r>
-        <w:t>npm install express</w:t>
+      <w:proofErr w:type="spellStart"/>
+      <w:r>
+        <w:t>npm</w:t>
+      </w:r>
+      <w:proofErr w:type="spellEnd"/>
+      <w:r>
+        <w:t xml:space="preserve"> install express</w:t>
       </w:r>
     </w:p>
     <w:p>
@@ -1227,9 +1271,11 @@
       <w:pPr>
         <w:spacing w:after="0"/>
       </w:pPr>
+      <w:proofErr w:type="spellStart"/>
       <w:r>
         <w:t>javascript</w:t>
       </w:r>
+      <w:proofErr w:type="spellEnd"/>
     </w:p>
     <w:p>
       <w:pPr>
@@ -1244,44 +1290,90 @@
         <w:spacing w:after="0"/>
       </w:pPr>
       <w:r>
-        <w:t>const express = require('express');</w:t>
-      </w:r>
-    </w:p>
-    <w:p>
-      <w:pPr>
-        <w:spacing w:after="0"/>
-      </w:pPr>
-      <w:r>
-        <w:t>const app = express();</w:t>
-      </w:r>
-    </w:p>
-    <w:p>
-      <w:pPr>
-        <w:spacing w:after="0"/>
-      </w:pPr>
-      <w:r>
-        <w:t>const PORT = 5000;</w:t>
-      </w:r>
-    </w:p>
-    <w:p>
-      <w:pPr>
-        <w:spacing w:after="0"/>
-      </w:pPr>
-    </w:p>
-    <w:p>
-      <w:pPr>
-        <w:spacing w:after="0"/>
-      </w:pPr>
-      <w:r>
-        <w:t>app.get('/', (req, res) =&gt; {</w:t>
-      </w:r>
-    </w:p>
-    <w:p>
-      <w:pPr>
-        <w:spacing w:after="0"/>
-      </w:pPr>
-      <w:r>
-        <w:t xml:space="preserve">  res.send('Hello, Air Assist!');</w:t>
+        <w:t>const express = require('express'</w:t>
+      </w:r>
+      <w:proofErr w:type="gramStart"/>
+      <w:r>
+        <w:t>);</w:t>
+      </w:r>
+      <w:proofErr w:type="gramEnd"/>
+    </w:p>
+    <w:p>
+      <w:pPr>
+        <w:spacing w:after="0"/>
+      </w:pPr>
+      <w:r>
+        <w:t xml:space="preserve">const app = </w:t>
+      </w:r>
+      <w:proofErr w:type="gramStart"/>
+      <w:r>
+        <w:t>express(</w:t>
+      </w:r>
+      <w:proofErr w:type="gramEnd"/>
+      <w:r>
+        <w:t>);</w:t>
+      </w:r>
+    </w:p>
+    <w:p>
+      <w:pPr>
+        <w:spacing w:after="0"/>
+      </w:pPr>
+      <w:r>
+        <w:t xml:space="preserve">const PORT = </w:t>
+      </w:r>
+      <w:proofErr w:type="gramStart"/>
+      <w:r>
+        <w:t>5000;</w:t>
+      </w:r>
+      <w:proofErr w:type="gramEnd"/>
+    </w:p>
+    <w:p>
+      <w:pPr>
+        <w:spacing w:after="0"/>
+      </w:pPr>
+    </w:p>
+    <w:p>
+      <w:pPr>
+        <w:spacing w:after="0"/>
+      </w:pPr>
+      <w:proofErr w:type="spellStart"/>
+      <w:proofErr w:type="gramStart"/>
+      <w:r>
+        <w:t>app.get</w:t>
+      </w:r>
+      <w:proofErr w:type="spellEnd"/>
+      <w:r>
+        <w:t>(</w:t>
+      </w:r>
+      <w:proofErr w:type="gramEnd"/>
+      <w:r>
+        <w:t xml:space="preserve">'/', (req, </w:t>
+      </w:r>
+      <w:proofErr w:type="gramStart"/>
+      <w:r>
+        <w:t>res</w:t>
+      </w:r>
+      <w:proofErr w:type="gramEnd"/>
+      <w:r>
+        <w:t>) =&gt; {</w:t>
+      </w:r>
+    </w:p>
+    <w:p>
+      <w:pPr>
+        <w:spacing w:after="0"/>
+      </w:pPr>
+      <w:r>
+        <w:t xml:space="preserve">  </w:t>
+      </w:r>
+      <w:proofErr w:type="spellStart"/>
+      <w:proofErr w:type="gramStart"/>
+      <w:r>
+        <w:t>res.send</w:t>
+      </w:r>
+      <w:proofErr w:type="spellEnd"/>
+      <w:proofErr w:type="gramEnd"/>
+      <w:r>
+        <w:t>('Hello, Air Assist!');</w:t>
       </w:r>
     </w:p>
     <w:p>
@@ -1301,16 +1393,31 @@
       <w:pPr>
         <w:spacing w:after="0"/>
       </w:pPr>
-      <w:r>
-        <w:t>app.listen(PORT, () =&gt; {</w:t>
-      </w:r>
-    </w:p>
-    <w:p>
-      <w:pPr>
-        <w:spacing w:after="0"/>
-      </w:pPr>
-      <w:r>
-        <w:t xml:space="preserve">  console.log(`Server running on http://localhost:${PORT}`);</w:t>
+      <w:proofErr w:type="spellStart"/>
+      <w:proofErr w:type="gramStart"/>
+      <w:r>
+        <w:t>app.listen</w:t>
+      </w:r>
+      <w:proofErr w:type="spellEnd"/>
+      <w:proofErr w:type="gramEnd"/>
+      <w:r>
+        <w:t>(PORT, () =&gt; {</w:t>
+      </w:r>
+    </w:p>
+    <w:p>
+      <w:pPr>
+        <w:spacing w:after="0"/>
+      </w:pPr>
+      <w:r>
+        <w:t xml:space="preserve">  </w:t>
+      </w:r>
+      <w:proofErr w:type="gramStart"/>
+      <w:r>
+        <w:t>console.log(</w:t>
+      </w:r>
+      <w:proofErr w:type="gramEnd"/>
+      <w:r>
+        <w:t>`Server running on http://localhost:${PORT}`);</w:t>
       </w:r>
     </w:p>
     <w:p>
@@ -1681,8 +1788,13 @@
       <w:pPr>
         <w:spacing w:after="0"/>
       </w:pPr>
-      <w:r>
-        <w:t>npx create-react-app client</w:t>
+      <w:proofErr w:type="spellStart"/>
+      <w:r>
+        <w:t>npx</w:t>
+      </w:r>
+      <w:proofErr w:type="spellEnd"/>
+      <w:r>
+        <w:t xml:space="preserve"> create-react-app client</w:t>
       </w:r>
     </w:p>
     <w:p>
@@ -1811,9 +1923,14 @@
         </w:numPr>
         <w:spacing w:after="0"/>
       </w:pPr>
+      <w:proofErr w:type="gramStart"/>
       <w:r>
         <w:lastRenderedPageBreak/>
-        <w:t>Navigate to the client folder and start the app:</w:t>
+        <w:t>Navigate to</w:t>
+      </w:r>
+      <w:proofErr w:type="gramEnd"/>
+      <w:r>
+        <w:t xml:space="preserve"> the client folder and start the app:</w:t>
       </w:r>
     </w:p>
     <w:p>
@@ -1844,8 +1961,13 @@
       <w:pPr>
         <w:spacing w:after="0"/>
       </w:pPr>
-      <w:r>
-        <w:t>npm start</w:t>
+      <w:proofErr w:type="spellStart"/>
+      <w:r>
+        <w:t>npm</w:t>
+      </w:r>
+      <w:proofErr w:type="spellEnd"/>
+      <w:r>
+        <w:t xml:space="preserve"> start</w:t>
       </w:r>
     </w:p>
     <w:p>
@@ -1989,7 +2111,23 @@
         <w:spacing w:after="0"/>
       </w:pPr>
       <w:r>
-        <w:t>Delete unnecessary files in the src folder (e.g., App.test.js, logo.svg).</w:t>
+        <w:t>Delete unnecessary files in the </w:t>
+      </w:r>
+      <w:proofErr w:type="spellStart"/>
+      <w:r>
+        <w:t>src</w:t>
+      </w:r>
+      <w:proofErr w:type="spellEnd"/>
+      <w:r>
+        <w:t> folder (e.g., App.test.js, </w:t>
+      </w:r>
+      <w:proofErr w:type="spellStart"/>
+      <w:r>
+        <w:t>logo.svg</w:t>
+      </w:r>
+      <w:proofErr w:type="spellEnd"/>
+      <w:r>
+        <w:t>).</w:t>
       </w:r>
     </w:p>
     <w:p>
@@ -2054,9 +2192,11 @@
       <w:pPr>
         <w:spacing w:after="0"/>
       </w:pPr>
+      <w:proofErr w:type="spellStart"/>
       <w:r>
         <w:t>javascript</w:t>
       </w:r>
+      <w:proofErr w:type="spellEnd"/>
     </w:p>
     <w:p>
       <w:pPr>
@@ -2071,7 +2211,15 @@
         <w:spacing w:after="0"/>
       </w:pPr>
       <w:r>
-        <w:t>function App() {</w:t>
+        <w:t xml:space="preserve">function </w:t>
+      </w:r>
+      <w:proofErr w:type="gramStart"/>
+      <w:r>
+        <w:t>App(</w:t>
+      </w:r>
+      <w:proofErr w:type="gramEnd"/>
+      <w:r>
+        <w:t>) {</w:t>
       </w:r>
     </w:p>
     <w:p>
@@ -2095,7 +2243,15 @@
         <w:spacing w:after="0"/>
       </w:pPr>
       <w:r>
-        <w:t xml:space="preserve">      &lt;h1&gt;Welcome to Air Assist!&lt;/h1&gt;</w:t>
+        <w:t xml:space="preserve">      &lt;h1&gt;Welcome to Air </w:t>
+      </w:r>
+      <w:proofErr w:type="gramStart"/>
+      <w:r>
+        <w:t>Assist!&lt;</w:t>
+      </w:r>
+      <w:proofErr w:type="gramEnd"/>
+      <w:r>
+        <w:t>/h1&gt;</w:t>
       </w:r>
     </w:p>
     <w:p>
@@ -2419,7 +2575,15 @@
         <w:t>Frontend-Backend Separation</w:t>
       </w:r>
       <w:r>
-        <w:t>: Keeping the frontend and backend in separate folders makes your project more organized.</w:t>
+        <w:t xml:space="preserve">: Keeping the </w:t>
+      </w:r>
+      <w:proofErr w:type="gramStart"/>
+      <w:r>
+        <w:t>frontend</w:t>
+      </w:r>
+      <w:proofErr w:type="gramEnd"/>
+      <w:r>
+        <w:t xml:space="preserve"> and backend in separate folders makes your project more organized.</w:t>
       </w:r>
     </w:p>
     <w:p>
@@ -2531,9 +2695,19 @@
       <w:pPr>
         <w:spacing w:after="0"/>
       </w:pPr>
-      <w:r>
-        <w:t>npm install axios</w:t>
-      </w:r>
+      <w:proofErr w:type="spellStart"/>
+      <w:r>
+        <w:t>npm</w:t>
+      </w:r>
+      <w:proofErr w:type="spellEnd"/>
+      <w:r>
+        <w:t xml:space="preserve"> install </w:t>
+      </w:r>
+      <w:proofErr w:type="spellStart"/>
+      <w:r>
+        <w:t>axios</w:t>
+      </w:r>
+      <w:proofErr w:type="spellEnd"/>
     </w:p>
     <w:p>
       <w:pPr>
@@ -2595,7 +2769,23 @@
         <w:t>Axios</w:t>
       </w:r>
       <w:r>
-        <w:t> in your React app. The message about vulnerabilities is common in many npm packages, and it doesn’t necessarily mean your app is at risk. However, it’s good practice to address these issues if possible.</w:t>
+        <w:t xml:space="preserve"> in your React app. </w:t>
+      </w:r>
+      <w:proofErr w:type="gramStart"/>
+      <w:r>
+        <w:t>The message</w:t>
+      </w:r>
+      <w:proofErr w:type="gramEnd"/>
+      <w:r>
+        <w:t xml:space="preserve"> about vulnerabilities is common in many </w:t>
+      </w:r>
+      <w:proofErr w:type="spellStart"/>
+      <w:r>
+        <w:t>npm</w:t>
+      </w:r>
+      <w:proofErr w:type="spellEnd"/>
+      <w:r>
+        <w:t xml:space="preserve"> packages, and it doesn’t necessarily mean your app is at risk. However, it’s good practice to address these issues if possible.</w:t>
       </w:r>
     </w:p>
     <w:p>
@@ -2668,8 +2858,13 @@
       <w:pPr>
         <w:spacing w:after="0"/>
       </w:pPr>
-      <w:r>
-        <w:t>npm audit fix</w:t>
+      <w:proofErr w:type="spellStart"/>
+      <w:r>
+        <w:t>npm</w:t>
+      </w:r>
+      <w:proofErr w:type="spellEnd"/>
+      <w:r>
+        <w:t xml:space="preserve"> audit fix</w:t>
       </w:r>
     </w:p>
     <w:p>
@@ -2746,8 +2941,13 @@
       <w:pPr>
         <w:spacing w:after="0"/>
       </w:pPr>
-      <w:r>
-        <w:t xml:space="preserve">npm audit fix </w:t>
+      <w:proofErr w:type="spellStart"/>
+      <w:r>
+        <w:t>npm</w:t>
+      </w:r>
+      <w:proofErr w:type="spellEnd"/>
+      <w:r>
+        <w:t xml:space="preserve"> audit fix </w:t>
       </w:r>
       <w:r>
         <w:t>–</w:t>
@@ -2852,7 +3052,15 @@
         <w:spacing w:after="0"/>
       </w:pPr>
       <w:r>
-        <w:t>Open the App.js file in your client/src folder.</w:t>
+        <w:t>Open the App.js file in your client/</w:t>
+      </w:r>
+      <w:proofErr w:type="spellStart"/>
+      <w:r>
+        <w:t>src</w:t>
+      </w:r>
+      <w:proofErr w:type="spellEnd"/>
+      <w:r>
+        <w:t> folder.</w:t>
       </w:r>
     </w:p>
     <w:p>
@@ -2871,9 +3079,11 @@
       <w:pPr>
         <w:spacing w:after="0"/>
       </w:pPr>
+      <w:proofErr w:type="spellStart"/>
       <w:r>
         <w:t>javascript</w:t>
       </w:r>
+      <w:proofErr w:type="spellEnd"/>
     </w:p>
     <w:p>
       <w:pPr>
@@ -2888,7 +3098,28 @@
         <w:spacing w:after="0"/>
       </w:pPr>
       <w:r>
-        <w:t>import React, { useEffect, useState } from 'react';</w:t>
+        <w:t xml:space="preserve">import React, </w:t>
+      </w:r>
+      <w:proofErr w:type="gramStart"/>
+      <w:r>
+        <w:t xml:space="preserve">{ </w:t>
+      </w:r>
+      <w:proofErr w:type="spellStart"/>
+      <w:r>
+        <w:t>useEffect</w:t>
+      </w:r>
+      <w:proofErr w:type="spellEnd"/>
+      <w:proofErr w:type="gramEnd"/>
+      <w:r>
+        <w:t xml:space="preserve">, </w:t>
+      </w:r>
+      <w:proofErr w:type="spellStart"/>
+      <w:r>
+        <w:t>useState</w:t>
+      </w:r>
+      <w:proofErr w:type="spellEnd"/>
+      <w:r>
+        <w:t xml:space="preserve"> } from 'react';</w:t>
       </w:r>
     </w:p>
     <w:p>
@@ -2897,8 +3128,26 @@
       </w:pPr>
       <w:r>
         <w:lastRenderedPageBreak/>
-        <w:t>import axios from 'axios';</w:t>
-      </w:r>
+        <w:t xml:space="preserve">import </w:t>
+      </w:r>
+      <w:proofErr w:type="spellStart"/>
+      <w:r>
+        <w:t>axios</w:t>
+      </w:r>
+      <w:proofErr w:type="spellEnd"/>
+      <w:r>
+        <w:t xml:space="preserve"> from '</w:t>
+      </w:r>
+      <w:proofErr w:type="spellStart"/>
+      <w:r>
+        <w:t>axios</w:t>
+      </w:r>
+      <w:proofErr w:type="spellEnd"/>
+      <w:proofErr w:type="gramStart"/>
+      <w:r>
+        <w:t>';</w:t>
+      </w:r>
+      <w:proofErr w:type="gramEnd"/>
     </w:p>
     <w:p>
       <w:pPr>
@@ -2918,28 +3167,60 @@
         <w:spacing w:after="0"/>
       </w:pPr>
       <w:r>
-        <w:t xml:space="preserve">  const [message, setMessage] = useState('');</w:t>
-      </w:r>
-    </w:p>
-    <w:p>
-      <w:pPr>
-        <w:spacing w:after="0"/>
-      </w:pPr>
-    </w:p>
-    <w:p>
-      <w:pPr>
-        <w:spacing w:after="0"/>
-      </w:pPr>
-      <w:r>
-        <w:t xml:space="preserve">  useEffect(() =&gt; {</w:t>
-      </w:r>
-    </w:p>
-    <w:p>
-      <w:pPr>
-        <w:spacing w:after="0"/>
-      </w:pPr>
-      <w:r>
-        <w:t xml:space="preserve">    axios.get('http://localhost:5000')</w:t>
+        <w:t xml:space="preserve">  const [message, </w:t>
+      </w:r>
+      <w:proofErr w:type="spellStart"/>
+      <w:r>
+        <w:t>setMessage</w:t>
+      </w:r>
+      <w:proofErr w:type="spellEnd"/>
+      <w:r>
+        <w:t xml:space="preserve">] = </w:t>
+      </w:r>
+      <w:proofErr w:type="spellStart"/>
+      <w:r>
+        <w:t>useState</w:t>
+      </w:r>
+      <w:proofErr w:type="spellEnd"/>
+      <w:r>
+        <w:t>('');</w:t>
+      </w:r>
+    </w:p>
+    <w:p>
+      <w:pPr>
+        <w:spacing w:after="0"/>
+      </w:pPr>
+    </w:p>
+    <w:p>
+      <w:pPr>
+        <w:spacing w:after="0"/>
+      </w:pPr>
+      <w:r>
+        <w:t xml:space="preserve">  </w:t>
+      </w:r>
+      <w:proofErr w:type="spellStart"/>
+      <w:r>
+        <w:t>useEffect</w:t>
+      </w:r>
+      <w:proofErr w:type="spellEnd"/>
+      <w:r>
+        <w:t>(() =&gt; {</w:t>
+      </w:r>
+    </w:p>
+    <w:p>
+      <w:pPr>
+        <w:spacing w:after="0"/>
+      </w:pPr>
+      <w:r>
+        <w:t xml:space="preserve">    </w:t>
+      </w:r>
+      <w:proofErr w:type="spellStart"/>
+      <w:r>
+        <w:t>axios.get</w:t>
+      </w:r>
+      <w:proofErr w:type="spellEnd"/>
+      <w:r>
+        <w:t>('http://localhost:5000')</w:t>
       </w:r>
     </w:p>
     <w:p>
@@ -2955,7 +3236,23 @@
         <w:spacing w:after="0"/>
       </w:pPr>
       <w:r>
-        <w:t xml:space="preserve">        setMessage(response.data);</w:t>
+        <w:t xml:space="preserve">        </w:t>
+      </w:r>
+      <w:proofErr w:type="spellStart"/>
+      <w:r>
+        <w:t>setMessage</w:t>
+      </w:r>
+      <w:proofErr w:type="spellEnd"/>
+      <w:r>
+        <w:t>(</w:t>
+      </w:r>
+      <w:proofErr w:type="spellStart"/>
+      <w:r>
+        <w:t>response.data</w:t>
+      </w:r>
+      <w:proofErr w:type="spellEnd"/>
+      <w:r>
+        <w:t>);</w:t>
       </w:r>
     </w:p>
     <w:p>
@@ -2979,7 +3276,15 @@
         <w:spacing w:after="0"/>
       </w:pPr>
       <w:r>
-        <w:t xml:space="preserve">        console.error('Error fetching data:', error);</w:t>
+        <w:t xml:space="preserve">        </w:t>
+      </w:r>
+      <w:proofErr w:type="spellStart"/>
+      <w:r>
+        <w:t>console.error</w:t>
+      </w:r>
+      <w:proofErr w:type="spellEnd"/>
+      <w:r>
+        <w:t>('Error fetching data:', error);</w:t>
       </w:r>
     </w:p>
     <w:p>
@@ -3180,9 +3485,11 @@
       <w:pPr>
         <w:spacing w:after="0"/>
       </w:pPr>
+      <w:proofErr w:type="spellStart"/>
       <w:r>
         <w:t>javascript</w:t>
       </w:r>
+      <w:proofErr w:type="spellEnd"/>
     </w:p>
     <w:p>
       <w:pPr>
@@ -3197,15 +3504,44 @@
         <w:spacing w:after="0"/>
       </w:pPr>
       <w:r>
-        <w:t>const cors = require('cors');</w:t>
-      </w:r>
-    </w:p>
-    <w:p>
-      <w:pPr>
-        <w:spacing w:after="0"/>
-      </w:pPr>
-      <w:r>
-        <w:t>app.use(cors());</w:t>
+        <w:t xml:space="preserve">const </w:t>
+      </w:r>
+      <w:proofErr w:type="spellStart"/>
+      <w:r>
+        <w:t>cors</w:t>
+      </w:r>
+      <w:proofErr w:type="spellEnd"/>
+      <w:r>
+        <w:t xml:space="preserve"> = require('</w:t>
+      </w:r>
+      <w:proofErr w:type="spellStart"/>
+      <w:r>
+        <w:t>cors</w:t>
+      </w:r>
+      <w:proofErr w:type="spellEnd"/>
+      <w:r>
+        <w:t>');</w:t>
+      </w:r>
+    </w:p>
+    <w:p>
+      <w:pPr>
+        <w:spacing w:after="0"/>
+      </w:pPr>
+      <w:proofErr w:type="spellStart"/>
+      <w:r>
+        <w:t>app.use</w:t>
+      </w:r>
+      <w:proofErr w:type="spellEnd"/>
+      <w:r>
+        <w:t>(</w:t>
+      </w:r>
+      <w:proofErr w:type="spellStart"/>
+      <w:r>
+        <w:t>cors</w:t>
+      </w:r>
+      <w:proofErr w:type="spellEnd"/>
+      <w:r>
+        <w:t>());</w:t>
       </w:r>
     </w:p>
     <w:p>
@@ -3263,7 +3599,15 @@
         <w:spacing w:after="0"/>
       </w:pPr>
       <w:r>
-        <w:t>Install the cors package:</w:t>
+        <w:t>Install the </w:t>
+      </w:r>
+      <w:proofErr w:type="spellStart"/>
+      <w:r>
+        <w:t>cors</w:t>
+      </w:r>
+      <w:proofErr w:type="spellEnd"/>
+      <w:r>
+        <w:t> package:</w:t>
       </w:r>
     </w:p>
     <w:p>
@@ -3311,7 +3655,15 @@
         <w:spacing w:after="0"/>
       </w:pPr>
       <w:r>
-        <w:t>Install cors:</w:t>
+        <w:t>Install </w:t>
+      </w:r>
+      <w:proofErr w:type="spellStart"/>
+      <w:r>
+        <w:t>cors</w:t>
+      </w:r>
+      <w:proofErr w:type="spellEnd"/>
+      <w:r>
+        <w:t>:</w:t>
       </w:r>
     </w:p>
     <w:p>
@@ -3334,9 +3686,19 @@
       <w:pPr>
         <w:spacing w:after="0"/>
       </w:pPr>
-      <w:r>
-        <w:t>npm install cors</w:t>
-      </w:r>
+      <w:proofErr w:type="spellStart"/>
+      <w:r>
+        <w:t>npm</w:t>
+      </w:r>
+      <w:proofErr w:type="spellEnd"/>
+      <w:r>
+        <w:t xml:space="preserve"> install </w:t>
+      </w:r>
+      <w:proofErr w:type="spellStart"/>
+      <w:r>
+        <w:t>cors</w:t>
+      </w:r>
+      <w:proofErr w:type="spellEnd"/>
     </w:p>
     <w:p>
       <w:pPr>
@@ -3583,8 +3945,13 @@
       <w:pPr>
         <w:spacing w:after="0"/>
       </w:pPr>
-      <w:r>
-        <w:t>npm start</w:t>
+      <w:proofErr w:type="spellStart"/>
+      <w:r>
+        <w:t>npm</w:t>
+      </w:r>
+      <w:proofErr w:type="spellEnd"/>
+      <w:r>
+        <w:t xml:space="preserve"> start</w:t>
       </w:r>
     </w:p>
     <w:p>
@@ -3870,8 +4237,16 @@
         <w:rPr>
           <w:color w:val="D86DCB" w:themeColor="accent5" w:themeTint="99"/>
         </w:rPr>
-        <w:t>So I uninstalled node.js and reinstalled less newer versions version 20. Smtng</w:t>
-      </w:r>
+        <w:t xml:space="preserve">So I uninstalled node.js and reinstalled less newer versions version 20. </w:t>
+      </w:r>
+      <w:proofErr w:type="spellStart"/>
+      <w:r>
+        <w:rPr>
+          <w:color w:val="D86DCB" w:themeColor="accent5" w:themeTint="99"/>
+        </w:rPr>
+        <w:t>Smtng</w:t>
+      </w:r>
+      <w:proofErr w:type="spellEnd"/>
     </w:p>
     <w:p>
       <w:pPr>
@@ -4126,7 +4501,15 @@
         <w:spacing w:after="0"/>
       </w:pPr>
       <w:r>
-        <w:t>Added a .gitignore file to exclude unnecessary files from version control.</w:t>
+        <w:t>Added a .</w:t>
+      </w:r>
+      <w:proofErr w:type="spellStart"/>
+      <w:r>
+        <w:t>gitignore</w:t>
+      </w:r>
+      <w:proofErr w:type="spellEnd"/>
+      <w:r>
+        <w:t> file to exclude unnecessary files from version control.</w:t>
       </w:r>
     </w:p>
     <w:p>
@@ -4733,7 +5116,23 @@
           <w:b/>
           <w:bCs/>
         </w:rPr>
-        <w:t>Step 2: Create the AirAssistDB Database</w:t>
+        <w:t>Step 2: Create the </w:t>
+      </w:r>
+      <w:proofErr w:type="spellStart"/>
+      <w:r>
+        <w:rPr>
+          <w:b/>
+          <w:bCs/>
+        </w:rPr>
+        <w:t>AirAssistDB</w:t>
+      </w:r>
+      <w:proofErr w:type="spellEnd"/>
+      <w:r>
+        <w:rPr>
+          <w:b/>
+          <w:bCs/>
+        </w:rPr>
+        <w:t> Database</w:t>
       </w:r>
     </w:p>
     <w:p>
@@ -4774,9 +5173,11 @@
       <w:pPr>
         <w:spacing w:after="0"/>
       </w:pPr>
+      <w:proofErr w:type="spellStart"/>
       <w:r>
         <w:t>sql</w:t>
       </w:r>
+      <w:proofErr w:type="spellEnd"/>
     </w:p>
     <w:p>
       <w:pPr>
@@ -4791,8 +5192,18 @@
         <w:spacing w:after="0"/>
       </w:pPr>
       <w:r>
-        <w:t>CREATE DATABASE AirAssistDB;</w:t>
-      </w:r>
+        <w:t xml:space="preserve">CREATE DATABASE </w:t>
+      </w:r>
+      <w:proofErr w:type="spellStart"/>
+      <w:proofErr w:type="gramStart"/>
+      <w:r>
+        <w:t>AirAssistDB</w:t>
+      </w:r>
+      <w:proofErr w:type="spellEnd"/>
+      <w:r>
+        <w:t>;</w:t>
+      </w:r>
+      <w:proofErr w:type="gramEnd"/>
     </w:p>
     <w:p>
       <w:pPr>
@@ -4810,9 +5221,11 @@
       <w:pPr>
         <w:spacing w:after="0"/>
       </w:pPr>
+      <w:proofErr w:type="spellStart"/>
       <w:r>
         <w:t>sql</w:t>
       </w:r>
+      <w:proofErr w:type="spellEnd"/>
     </w:p>
     <w:p>
       <w:pPr>
@@ -4827,8 +5240,13 @@
         <w:spacing w:after="0"/>
       </w:pPr>
       <w:r>
-        <w:t>SHOW DATABASES;</w:t>
-      </w:r>
+        <w:t xml:space="preserve">SHOW </w:t>
+      </w:r>
+      <w:proofErr w:type="gramStart"/>
+      <w:r>
+        <w:t>DATABASES;</w:t>
+      </w:r>
+      <w:proofErr w:type="gramEnd"/>
     </w:p>
     <w:p>
       <w:pPr>
@@ -4839,7 +5257,15 @@
         <w:spacing w:after="0"/>
       </w:pPr>
       <w:r>
-        <w:t>You should see AirAssistDB in the list.</w:t>
+        <w:t>You should see </w:t>
+      </w:r>
+      <w:proofErr w:type="spellStart"/>
+      <w:r>
+        <w:t>AirAssistDB</w:t>
+      </w:r>
+      <w:proofErr w:type="spellEnd"/>
+      <w:r>
+        <w:t> in the list.</w:t>
       </w:r>
     </w:p>
     <w:p>
@@ -4878,16 +5304,26 @@
       </w:pPr>
       <w:r>
         <w:lastRenderedPageBreak/>
-        <w:t>Switch to the AirAssistDB database:</w:t>
-      </w:r>
-    </w:p>
-    <w:p>
-      <w:pPr>
-        <w:spacing w:after="0"/>
-      </w:pPr>
+        <w:t>Switch to the </w:t>
+      </w:r>
+      <w:proofErr w:type="spellStart"/>
+      <w:r>
+        <w:t>AirAssistDB</w:t>
+      </w:r>
+      <w:proofErr w:type="spellEnd"/>
+      <w:r>
+        <w:t> database:</w:t>
+      </w:r>
+    </w:p>
+    <w:p>
+      <w:pPr>
+        <w:spacing w:after="0"/>
+      </w:pPr>
+      <w:proofErr w:type="spellStart"/>
       <w:r>
         <w:t>sql</w:t>
       </w:r>
+      <w:proofErr w:type="spellEnd"/>
     </w:p>
     <w:p>
       <w:pPr>
@@ -4902,8 +5338,18 @@
         <w:spacing w:after="0"/>
       </w:pPr>
       <w:r>
-        <w:t>USE AirAssistDB;</w:t>
-      </w:r>
+        <w:t xml:space="preserve">USE </w:t>
+      </w:r>
+      <w:proofErr w:type="spellStart"/>
+      <w:proofErr w:type="gramStart"/>
+      <w:r>
+        <w:t>AirAssistDB</w:t>
+      </w:r>
+      <w:proofErr w:type="spellEnd"/>
+      <w:r>
+        <w:t>;</w:t>
+      </w:r>
+      <w:proofErr w:type="gramEnd"/>
     </w:p>
     <w:p>
       <w:pPr>
@@ -4914,16 +5360,26 @@
         <w:spacing w:after="0"/>
       </w:pPr>
       <w:r>
-        <w:t>Create the users table:</w:t>
-      </w:r>
-    </w:p>
-    <w:p>
-      <w:pPr>
-        <w:spacing w:after="0"/>
-      </w:pPr>
+        <w:t>Create the </w:t>
+      </w:r>
+      <w:proofErr w:type="gramStart"/>
+      <w:r>
+        <w:t>users</w:t>
+      </w:r>
+      <w:proofErr w:type="gramEnd"/>
+      <w:r>
+        <w:t> table:</w:t>
+      </w:r>
+    </w:p>
+    <w:p>
+      <w:pPr>
+        <w:spacing w:after="0"/>
+      </w:pPr>
+      <w:proofErr w:type="spellStart"/>
       <w:r>
         <w:t>sql</w:t>
       </w:r>
+      <w:proofErr w:type="spellEnd"/>
     </w:p>
     <w:p>
       <w:pPr>
@@ -4954,15 +5410,31 @@
         <w:spacing w:after="0"/>
       </w:pPr>
       <w:r>
-        <w:t xml:space="preserve">    email VARCHAR(255) UNIQUE NOT NULL,</w:t>
-      </w:r>
-    </w:p>
-    <w:p>
-      <w:pPr>
-        <w:spacing w:after="0"/>
-      </w:pPr>
-      <w:r>
-        <w:t xml:space="preserve">    password VARCHAR(255) NOT NULL</w:t>
+        <w:t xml:space="preserve">    email </w:t>
+      </w:r>
+      <w:proofErr w:type="gramStart"/>
+      <w:r>
+        <w:t>VARCHAR(</w:t>
+      </w:r>
+      <w:proofErr w:type="gramEnd"/>
+      <w:r>
+        <w:t>255) UNIQUE NOT NULL,</w:t>
+      </w:r>
+    </w:p>
+    <w:p>
+      <w:pPr>
+        <w:spacing w:after="0"/>
+      </w:pPr>
+      <w:r>
+        <w:t xml:space="preserve">    password </w:t>
+      </w:r>
+      <w:proofErr w:type="gramStart"/>
+      <w:r>
+        <w:t>VARCHAR(</w:t>
+      </w:r>
+      <w:proofErr w:type="gramEnd"/>
+      <w:r>
+        <w:t>255) NOT NULL</w:t>
       </w:r>
     </w:p>
     <w:p>
@@ -4982,16 +5454,26 @@
         <w:spacing w:after="0"/>
       </w:pPr>
       <w:r>
-        <w:t>Create the help_requests table:</w:t>
-      </w:r>
-    </w:p>
-    <w:p>
-      <w:pPr>
-        <w:spacing w:after="0"/>
-      </w:pPr>
+        <w:t>Create the </w:t>
+      </w:r>
+      <w:proofErr w:type="spellStart"/>
+      <w:r>
+        <w:t>help_requests</w:t>
+      </w:r>
+      <w:proofErr w:type="spellEnd"/>
+      <w:r>
+        <w:t> table:</w:t>
+      </w:r>
+    </w:p>
+    <w:p>
+      <w:pPr>
+        <w:spacing w:after="0"/>
+      </w:pPr>
+      <w:proofErr w:type="spellStart"/>
       <w:r>
         <w:t>sql</w:t>
       </w:r>
+      <w:proofErr w:type="spellEnd"/>
     </w:p>
     <w:p>
       <w:pPr>
@@ -5006,7 +5488,15 @@
         <w:spacing w:after="0"/>
       </w:pPr>
       <w:r>
-        <w:t>CREATE TABLE help_requests (</w:t>
+        <w:t xml:space="preserve">CREATE TABLE </w:t>
+      </w:r>
+      <w:proofErr w:type="spellStart"/>
+      <w:r>
+        <w:t>help_requests</w:t>
+      </w:r>
+      <w:proofErr w:type="spellEnd"/>
+      <w:r>
+        <w:t xml:space="preserve"> (</w:t>
       </w:r>
     </w:p>
     <w:p>
@@ -5022,23 +5512,47 @@
         <w:spacing w:after="0"/>
       </w:pPr>
       <w:r>
-        <w:t xml:space="preserve">    user_id INT,</w:t>
-      </w:r>
-    </w:p>
-    <w:p>
-      <w:pPr>
-        <w:spacing w:after="0"/>
-      </w:pPr>
-      <w:r>
-        <w:t xml:space="preserve">    type VARCHAR(100),</w:t>
-      </w:r>
-    </w:p>
-    <w:p>
-      <w:pPr>
-        <w:spacing w:after="0"/>
-      </w:pPr>
-      <w:r>
-        <w:t xml:space="preserve">    location VARCHAR(255),</w:t>
+        <w:t xml:space="preserve">    </w:t>
+      </w:r>
+      <w:proofErr w:type="spellStart"/>
+      <w:r>
+        <w:t>user_id</w:t>
+      </w:r>
+      <w:proofErr w:type="spellEnd"/>
+      <w:r>
+        <w:t xml:space="preserve"> INT,</w:t>
+      </w:r>
+    </w:p>
+    <w:p>
+      <w:pPr>
+        <w:spacing w:after="0"/>
+      </w:pPr>
+      <w:r>
+        <w:t xml:space="preserve">    type </w:t>
+      </w:r>
+      <w:proofErr w:type="gramStart"/>
+      <w:r>
+        <w:t>VARCHAR(</w:t>
+      </w:r>
+      <w:proofErr w:type="gramEnd"/>
+      <w:r>
+        <w:t>100),</w:t>
+      </w:r>
+    </w:p>
+    <w:p>
+      <w:pPr>
+        <w:spacing w:after="0"/>
+      </w:pPr>
+      <w:r>
+        <w:t xml:space="preserve">    location </w:t>
+      </w:r>
+      <w:proofErr w:type="gramStart"/>
+      <w:r>
+        <w:t>VARCHAR(</w:t>
+      </w:r>
+      <w:proofErr w:type="gramEnd"/>
+      <w:r>
+        <w:t>255),</w:t>
       </w:r>
     </w:p>
     <w:p>
@@ -5054,7 +5568,15 @@
         <w:spacing w:after="0"/>
       </w:pPr>
       <w:r>
-        <w:t xml:space="preserve">    FOREIGN KEY (user_id) REFERENCES users(id)</w:t>
+        <w:t xml:space="preserve">    FOREIGN KEY (</w:t>
+      </w:r>
+      <w:proofErr w:type="spellStart"/>
+      <w:r>
+        <w:t>user_id</w:t>
+      </w:r>
+      <w:proofErr w:type="spellEnd"/>
+      <w:r>
+        <w:t>) REFERENCES users(id)</w:t>
       </w:r>
     </w:p>
     <w:p>
@@ -5081,9 +5603,11 @@
       <w:pPr>
         <w:spacing w:after="0"/>
       </w:pPr>
+      <w:proofErr w:type="spellStart"/>
       <w:r>
         <w:t>sql</w:t>
       </w:r>
+      <w:proofErr w:type="spellEnd"/>
     </w:p>
     <w:p>
       <w:pPr>
@@ -5098,8 +5622,13 @@
         <w:spacing w:after="0"/>
       </w:pPr>
       <w:r>
-        <w:t>SHOW TABLES;</w:t>
-      </w:r>
+        <w:t xml:space="preserve">SHOW </w:t>
+      </w:r>
+      <w:proofErr w:type="gramStart"/>
+      <w:r>
+        <w:t>TABLES;</w:t>
+      </w:r>
+      <w:proofErr w:type="gramEnd"/>
     </w:p>
     <w:p>
       <w:pPr>
@@ -5110,7 +5639,15 @@
         <w:spacing w:after="0"/>
       </w:pPr>
       <w:r>
-        <w:t>You should see users and help_requests in the list.</w:t>
+        <w:t>You should see users and </w:t>
+      </w:r>
+      <w:proofErr w:type="spellStart"/>
+      <w:r>
+        <w:t>help_requests</w:t>
+      </w:r>
+      <w:proofErr w:type="spellEnd"/>
+      <w:r>
+        <w:t> in the list.</w:t>
       </w:r>
     </w:p>
     <w:p>
@@ -5191,16 +5728,26 @@
         <w:spacing w:after="0"/>
       </w:pPr>
       <w:r>
-        <w:t>Insert a sample user into the users table:</w:t>
-      </w:r>
-    </w:p>
-    <w:p>
-      <w:pPr>
-        <w:spacing w:after="0"/>
-      </w:pPr>
+        <w:t>Insert a sample user into the </w:t>
+      </w:r>
+      <w:proofErr w:type="gramStart"/>
+      <w:r>
+        <w:t>users</w:t>
+      </w:r>
+      <w:proofErr w:type="gramEnd"/>
+      <w:r>
+        <w:t> table:</w:t>
+      </w:r>
+    </w:p>
+    <w:p>
+      <w:pPr>
+        <w:spacing w:after="0"/>
+      </w:pPr>
+      <w:proofErr w:type="spellStart"/>
       <w:r>
         <w:t>sql</w:t>
       </w:r>
+      <w:proofErr w:type="spellEnd"/>
     </w:p>
     <w:p>
       <w:pPr>
@@ -5215,8 +5762,13 @@
         <w:spacing w:after="0"/>
       </w:pPr>
       <w:r>
-        <w:t>INSERT INTO users (email, password) VALUES ('test@example.com', 'password123');</w:t>
-      </w:r>
+        <w:t>INSERT INTO users (email, password) VALUES ('test@example.com', 'password123'</w:t>
+      </w:r>
+      <w:proofErr w:type="gramStart"/>
+      <w:r>
+        <w:t>);</w:t>
+      </w:r>
+      <w:proofErr w:type="gramEnd"/>
     </w:p>
     <w:p>
       <w:pPr>
@@ -5227,16 +5779,26 @@
         <w:spacing w:after="0"/>
       </w:pPr>
       <w:r>
-        <w:t>Insert a sample help request into the help_requests table:</w:t>
-      </w:r>
-    </w:p>
-    <w:p>
-      <w:pPr>
-        <w:spacing w:after="0"/>
-      </w:pPr>
+        <w:t>Insert a sample help request into the </w:t>
+      </w:r>
+      <w:proofErr w:type="spellStart"/>
+      <w:r>
+        <w:t>help_requests</w:t>
+      </w:r>
+      <w:proofErr w:type="spellEnd"/>
+      <w:r>
+        <w:t> table:</w:t>
+      </w:r>
+    </w:p>
+    <w:p>
+      <w:pPr>
+        <w:spacing w:after="0"/>
+      </w:pPr>
+      <w:proofErr w:type="spellStart"/>
       <w:r>
         <w:t>sql</w:t>
       </w:r>
+      <w:proofErr w:type="spellEnd"/>
     </w:p>
     <w:p>
       <w:pPr>
@@ -5251,15 +5813,39 @@
         <w:spacing w:after="0"/>
       </w:pPr>
       <w:r>
-        <w:t>INSERT INTO help_requests (user_id, type, location, time)</w:t>
-      </w:r>
-    </w:p>
-    <w:p>
-      <w:pPr>
-        <w:spacing w:after="0"/>
-      </w:pPr>
-      <w:r>
-        <w:t>VALUES (1, 'Medical', 'New York', NOW());</w:t>
+        <w:t xml:space="preserve">INSERT INTO </w:t>
+      </w:r>
+      <w:proofErr w:type="spellStart"/>
+      <w:r>
+        <w:t>help_requests</w:t>
+      </w:r>
+      <w:proofErr w:type="spellEnd"/>
+      <w:r>
+        <w:t xml:space="preserve"> (</w:t>
+      </w:r>
+      <w:proofErr w:type="spellStart"/>
+      <w:r>
+        <w:t>user_id</w:t>
+      </w:r>
+      <w:proofErr w:type="spellEnd"/>
+      <w:r>
+        <w:t>, type, location, time)</w:t>
+      </w:r>
+    </w:p>
+    <w:p>
+      <w:pPr>
+        <w:spacing w:after="0"/>
+      </w:pPr>
+      <w:r>
+        <w:t xml:space="preserve">VALUES (1, 'Medical', 'New York', </w:t>
+      </w:r>
+      <w:proofErr w:type="gramStart"/>
+      <w:r>
+        <w:t>NOW(</w:t>
+      </w:r>
+      <w:proofErr w:type="gramEnd"/>
+      <w:r>
+        <w:t>));</w:t>
       </w:r>
     </w:p>
     <w:p>
@@ -5304,9 +5890,11 @@
       <w:pPr>
         <w:spacing w:after="0"/>
       </w:pPr>
+      <w:proofErr w:type="spellStart"/>
       <w:r>
         <w:t>sql</w:t>
       </w:r>
+      <w:proofErr w:type="spellEnd"/>
     </w:p>
     <w:p>
       <w:pPr>
@@ -5321,8 +5909,13 @@
         <w:spacing w:after="0"/>
       </w:pPr>
       <w:r>
-        <w:t>SELECT * FROM users;</w:t>
-      </w:r>
+        <w:t xml:space="preserve">SELECT * FROM </w:t>
+      </w:r>
+      <w:proofErr w:type="gramStart"/>
+      <w:r>
+        <w:t>users;</w:t>
+      </w:r>
+      <w:proofErr w:type="gramEnd"/>
     </w:p>
     <w:p>
       <w:pPr>
@@ -5383,9 +5976,11 @@
       <w:pPr>
         <w:spacing w:after="0"/>
       </w:pPr>
+      <w:proofErr w:type="spellStart"/>
       <w:r>
         <w:t>sql</w:t>
       </w:r>
+      <w:proofErr w:type="spellEnd"/>
     </w:p>
     <w:p>
       <w:pPr>
@@ -5400,8 +5995,21 @@
         <w:spacing w:after="0"/>
       </w:pPr>
       <w:r>
-        <w:t>SELECT * FROM help_requests;</w:t>
-      </w:r>
+        <w:t xml:space="preserve">SELECT * FROM </w:t>
+      </w:r>
+      <w:proofErr w:type="spellStart"/>
+      <w:r>
+        <w:t>help_</w:t>
+      </w:r>
+      <w:proofErr w:type="gramStart"/>
+      <w:r>
+        <w:t>requests</w:t>
+      </w:r>
+      <w:proofErr w:type="spellEnd"/>
+      <w:r>
+        <w:t>;</w:t>
+      </w:r>
+      <w:proofErr w:type="gramEnd"/>
     </w:p>
     <w:p>
       <w:pPr>
@@ -5469,7 +6077,23 @@
           <w:b/>
           <w:bCs/>
         </w:rPr>
-        <w:t>Step 6: Use the Visual Tools</w:t>
+        <w:t xml:space="preserve">Step 6: Use </w:t>
+      </w:r>
+      <w:proofErr w:type="gramStart"/>
+      <w:r>
+        <w:rPr>
+          <w:b/>
+          <w:bCs/>
+        </w:rPr>
+        <w:t>the Visual</w:t>
+      </w:r>
+      <w:proofErr w:type="gramEnd"/>
+      <w:r>
+        <w:rPr>
+          <w:b/>
+          <w:bCs/>
+        </w:rPr>
+        <w:t xml:space="preserve"> Tools</w:t>
       </w:r>
     </w:p>
     <w:p>
@@ -5654,7 +6278,15 @@
         <w:spacing w:after="0"/>
       </w:pPr>
       <w:r>
-        <w:t>Save your SQL queries in .sql files for future use.</w:t>
+        <w:t>Save your SQL queries in .</w:t>
+      </w:r>
+      <w:proofErr w:type="spellStart"/>
+      <w:r>
+        <w:t>sql</w:t>
+      </w:r>
+      <w:proofErr w:type="spellEnd"/>
+      <w:r>
+        <w:t> files for future use.</w:t>
       </w:r>
     </w:p>
     <w:p>
@@ -5777,7 +6409,15 @@
       </w:pPr>
       <w:r>
         <w:lastRenderedPageBreak/>
-        <w:t>Create the AirAssistDB database and tables.</w:t>
+        <w:t>Create the </w:t>
+      </w:r>
+      <w:proofErr w:type="spellStart"/>
+      <w:r>
+        <w:t>AirAssistDB</w:t>
+      </w:r>
+      <w:proofErr w:type="spellEnd"/>
+      <w:r>
+        <w:t> database and tables.</w:t>
       </w:r>
     </w:p>
     <w:p>
@@ -5990,48 +6630,94 @@
         <w:spacing w:after="0"/>
       </w:pPr>
       <w:r>
-        <w:t>Run the following command in MySQL to create a new database (replace air_assist_db with any name you like):</w:t>
-      </w:r>
-    </w:p>
-    <w:p>
-      <w:pPr>
-        <w:spacing w:after="0"/>
-      </w:pPr>
+        <w:t xml:space="preserve">Run the following command in MySQL to create a new database (replace </w:t>
+      </w:r>
+      <w:proofErr w:type="spellStart"/>
+      <w:r>
+        <w:t>air_assist_db</w:t>
+      </w:r>
+      <w:proofErr w:type="spellEnd"/>
+      <w:r>
+        <w:t xml:space="preserve"> with any name you like):</w:t>
+      </w:r>
+    </w:p>
+    <w:p>
+      <w:pPr>
+        <w:spacing w:after="0"/>
+      </w:pPr>
+      <w:proofErr w:type="spellStart"/>
       <w:r>
         <w:t>sql</w:t>
       </w:r>
-    </w:p>
-    <w:p>
-      <w:pPr>
-        <w:spacing w:after="0"/>
-      </w:pPr>
+      <w:proofErr w:type="spellEnd"/>
+    </w:p>
+    <w:p>
+      <w:pPr>
+        <w:spacing w:after="0"/>
+      </w:pPr>
+      <w:proofErr w:type="spellStart"/>
       <w:r>
         <w:t>CopyEdit</w:t>
       </w:r>
-    </w:p>
-    <w:p>
-      <w:pPr>
-        <w:spacing w:after="0"/>
-      </w:pPr>
-      <w:r>
-        <w:t>DROP DATABASE IF EXISTS air_assist_db; -- Deletes existing DB if it exists</w:t>
-      </w:r>
-    </w:p>
-    <w:p>
-      <w:pPr>
-        <w:spacing w:after="0"/>
-      </w:pPr>
-      <w:r>
-        <w:t>CREATE DATABASE air_assist_db;</w:t>
-      </w:r>
-    </w:p>
-    <w:p>
-      <w:pPr>
-        <w:spacing w:after="0"/>
-      </w:pPr>
-      <w:r>
-        <w:t>USE air_assist_db;</w:t>
-      </w:r>
+      <w:proofErr w:type="spellEnd"/>
+    </w:p>
+    <w:p>
+      <w:pPr>
+        <w:spacing w:after="0"/>
+      </w:pPr>
+      <w:r>
+        <w:t xml:space="preserve">DROP DATABASE IF EXISTS </w:t>
+      </w:r>
+      <w:proofErr w:type="spellStart"/>
+      <w:r>
+        <w:t>air_assist_db</w:t>
+      </w:r>
+      <w:proofErr w:type="spellEnd"/>
+      <w:r>
+        <w:t>; -- Deletes existing DB if it exists</w:t>
+      </w:r>
+    </w:p>
+    <w:p>
+      <w:pPr>
+        <w:spacing w:after="0"/>
+      </w:pPr>
+      <w:r>
+        <w:t xml:space="preserve">CREATE DATABASE </w:t>
+      </w:r>
+      <w:proofErr w:type="spellStart"/>
+      <w:r>
+        <w:t>air_assist_</w:t>
+      </w:r>
+      <w:proofErr w:type="gramStart"/>
+      <w:r>
+        <w:t>db</w:t>
+      </w:r>
+      <w:proofErr w:type="spellEnd"/>
+      <w:r>
+        <w:t>;</w:t>
+      </w:r>
+      <w:proofErr w:type="gramEnd"/>
+    </w:p>
+    <w:p>
+      <w:pPr>
+        <w:spacing w:after="0"/>
+      </w:pPr>
+      <w:r>
+        <w:t xml:space="preserve">USE </w:t>
+      </w:r>
+      <w:proofErr w:type="spellStart"/>
+      <w:r>
+        <w:t>air_assist_</w:t>
+      </w:r>
+      <w:proofErr w:type="gramStart"/>
+      <w:r>
+        <w:t>db</w:t>
+      </w:r>
+      <w:proofErr w:type="spellEnd"/>
+      <w:r>
+        <w:t>;</w:t>
+      </w:r>
+      <w:proofErr w:type="gramEnd"/>
     </w:p>
     <w:p>
       <w:pPr>
@@ -6102,17 +6788,21 @@
       <w:pPr>
         <w:spacing w:after="0"/>
       </w:pPr>
+      <w:proofErr w:type="spellStart"/>
       <w:r>
         <w:t>sql</w:t>
       </w:r>
-    </w:p>
-    <w:p>
-      <w:pPr>
-        <w:spacing w:after="0"/>
-      </w:pPr>
+      <w:proofErr w:type="spellEnd"/>
+    </w:p>
+    <w:p>
+      <w:pPr>
+        <w:spacing w:after="0"/>
+      </w:pPr>
+      <w:proofErr w:type="spellStart"/>
       <w:r>
         <w:t>CopyEdit</w:t>
       </w:r>
+      <w:proofErr w:type="spellEnd"/>
     </w:p>
     <w:p>
       <w:pPr>
@@ -6135,39 +6825,87 @@
         <w:spacing w:after="0"/>
       </w:pPr>
       <w:r>
-        <w:t xml:space="preserve">    name VARCHAR(255) NOT NULL,</w:t>
-      </w:r>
-    </w:p>
-    <w:p>
-      <w:pPr>
-        <w:spacing w:after="0"/>
-      </w:pPr>
-      <w:r>
-        <w:t xml:space="preserve">    email VARCHAR(255) UNIQUE NOT NULL,</w:t>
-      </w:r>
-    </w:p>
-    <w:p>
-      <w:pPr>
-        <w:spacing w:after="0"/>
-      </w:pPr>
-      <w:r>
-        <w:t xml:space="preserve">    phone VARCHAR(20) UNIQUE NOT NULL,</w:t>
-      </w:r>
-    </w:p>
-    <w:p>
-      <w:pPr>
-        <w:spacing w:after="0"/>
-      </w:pPr>
-      <w:r>
-        <w:t xml:space="preserve">    password VARCHAR(255) NOT NULL,</w:t>
-      </w:r>
-    </w:p>
-    <w:p>
-      <w:pPr>
-        <w:spacing w:after="0"/>
-      </w:pPr>
-      <w:r>
-        <w:t xml:space="preserve">    user_type ENUM('requester', 'helper') NOT NULL,</w:t>
+        <w:t xml:space="preserve">    name </w:t>
+      </w:r>
+      <w:proofErr w:type="gramStart"/>
+      <w:r>
+        <w:t>VARCHAR(</w:t>
+      </w:r>
+      <w:proofErr w:type="gramEnd"/>
+      <w:r>
+        <w:t>255) NOT NULL,</w:t>
+      </w:r>
+    </w:p>
+    <w:p>
+      <w:pPr>
+        <w:spacing w:after="0"/>
+      </w:pPr>
+      <w:r>
+        <w:t xml:space="preserve">    email </w:t>
+      </w:r>
+      <w:proofErr w:type="gramStart"/>
+      <w:r>
+        <w:t>VARCHAR(</w:t>
+      </w:r>
+      <w:proofErr w:type="gramEnd"/>
+      <w:r>
+        <w:t>255) UNIQUE NOT NULL,</w:t>
+      </w:r>
+    </w:p>
+    <w:p>
+      <w:pPr>
+        <w:spacing w:after="0"/>
+      </w:pPr>
+      <w:r>
+        <w:t xml:space="preserve">    phone </w:t>
+      </w:r>
+      <w:proofErr w:type="gramStart"/>
+      <w:r>
+        <w:t>VARCHAR(</w:t>
+      </w:r>
+      <w:proofErr w:type="gramEnd"/>
+      <w:r>
+        <w:t>20) UNIQUE NOT NULL,</w:t>
+      </w:r>
+    </w:p>
+    <w:p>
+      <w:pPr>
+        <w:spacing w:after="0"/>
+      </w:pPr>
+      <w:r>
+        <w:t xml:space="preserve">    password </w:t>
+      </w:r>
+      <w:proofErr w:type="gramStart"/>
+      <w:r>
+        <w:t>VARCHAR(</w:t>
+      </w:r>
+      <w:proofErr w:type="gramEnd"/>
+      <w:r>
+        <w:t>255) NOT NULL,</w:t>
+      </w:r>
+    </w:p>
+    <w:p>
+      <w:pPr>
+        <w:spacing w:after="0"/>
+      </w:pPr>
+      <w:r>
+        <w:t xml:space="preserve">    </w:t>
+      </w:r>
+      <w:proofErr w:type="spellStart"/>
+      <w:r>
+        <w:t>user_type</w:t>
+      </w:r>
+      <w:proofErr w:type="spellEnd"/>
+      <w:r>
+        <w:t xml:space="preserve"> </w:t>
+      </w:r>
+      <w:proofErr w:type="gramStart"/>
+      <w:r>
+        <w:t>ENUM(</w:t>
+      </w:r>
+      <w:proofErr w:type="gramEnd"/>
+      <w:r>
+        <w:t>'requester', 'helper') NOT NULL,</w:t>
       </w:r>
     </w:p>
     <w:p>
@@ -6191,31 +6929,63 @@
         <w:spacing w:after="0"/>
       </w:pPr>
       <w:r>
-        <w:t xml:space="preserve">    latitude DECIMAL(10, 8), </w:t>
-      </w:r>
-    </w:p>
-    <w:p>
-      <w:pPr>
-        <w:spacing w:after="0"/>
-      </w:pPr>
-      <w:r>
-        <w:t xml:space="preserve">    longitude DECIMAL(11, 8),</w:t>
-      </w:r>
-    </w:p>
-    <w:p>
-      <w:pPr>
-        <w:spacing w:after="0"/>
-      </w:pPr>
-      <w:r>
-        <w:t xml:space="preserve">    created_at TIMESTAMP DEFAULT CURRENT_TIMESTAMP,</w:t>
-      </w:r>
-    </w:p>
-    <w:p>
-      <w:pPr>
-        <w:spacing w:after="0"/>
-      </w:pPr>
-      <w:r>
-        <w:t xml:space="preserve">    updated_at TIMESTAMP DEFAULT CURRENT_TIMESTAMP ON UPDATE CURRENT_TIMESTAMP</w:t>
+        <w:t xml:space="preserve">    latitude </w:t>
+      </w:r>
+      <w:proofErr w:type="gramStart"/>
+      <w:r>
+        <w:t>DECIMAL(</w:t>
+      </w:r>
+      <w:proofErr w:type="gramEnd"/>
+      <w:r>
+        <w:t xml:space="preserve">10, 8), </w:t>
+      </w:r>
+    </w:p>
+    <w:p>
+      <w:pPr>
+        <w:spacing w:after="0"/>
+      </w:pPr>
+      <w:r>
+        <w:t xml:space="preserve">    longitude </w:t>
+      </w:r>
+      <w:proofErr w:type="gramStart"/>
+      <w:r>
+        <w:t>DECIMAL(</w:t>
+      </w:r>
+      <w:proofErr w:type="gramEnd"/>
+      <w:r>
+        <w:t>11, 8),</w:t>
+      </w:r>
+    </w:p>
+    <w:p>
+      <w:pPr>
+        <w:spacing w:after="0"/>
+      </w:pPr>
+      <w:r>
+        <w:t xml:space="preserve">    </w:t>
+      </w:r>
+      <w:proofErr w:type="spellStart"/>
+      <w:r>
+        <w:t>created_at</w:t>
+      </w:r>
+      <w:proofErr w:type="spellEnd"/>
+      <w:r>
+        <w:t xml:space="preserve"> TIMESTAMP DEFAULT CURRENT_TIMESTAMP,</w:t>
+      </w:r>
+    </w:p>
+    <w:p>
+      <w:pPr>
+        <w:spacing w:after="0"/>
+      </w:pPr>
+      <w:r>
+        <w:t xml:space="preserve">    </w:t>
+      </w:r>
+      <w:proofErr w:type="spellStart"/>
+      <w:r>
+        <w:t>updated_at</w:t>
+      </w:r>
+      <w:proofErr w:type="spellEnd"/>
+      <w:r>
+        <w:t xml:space="preserve"> TIMESTAMP DEFAULT CURRENT_TIMESTAMP ON UPDATE CURRENT_TIMESTAMP</w:t>
       </w:r>
     </w:p>
     <w:p>
@@ -6246,18 +7016,22 @@
       <w:pPr>
         <w:spacing w:after="0"/>
       </w:pPr>
+      <w:proofErr w:type="spellStart"/>
       <w:r>
         <w:lastRenderedPageBreak/>
         <w:t>sql</w:t>
       </w:r>
-    </w:p>
-    <w:p>
-      <w:pPr>
-        <w:spacing w:after="0"/>
-      </w:pPr>
+      <w:proofErr w:type="spellEnd"/>
+    </w:p>
+    <w:p>
+      <w:pPr>
+        <w:spacing w:after="0"/>
+      </w:pPr>
+      <w:proofErr w:type="spellStart"/>
       <w:r>
         <w:t>CopyEdit</w:t>
       </w:r>
+      <w:proofErr w:type="spellEnd"/>
     </w:p>
     <w:p>
       <w:pPr>
@@ -6280,79 +7054,167 @@
         <w:spacing w:after="0"/>
       </w:pPr>
       <w:r>
-        <w:t xml:space="preserve">    requester_id INT NOT NULL,</w:t>
-      </w:r>
-    </w:p>
-    <w:p>
-      <w:pPr>
-        <w:spacing w:after="0"/>
-      </w:pPr>
-      <w:r>
-        <w:t xml:space="preserve">    helper_id INT DEFAULT NULL, </w:t>
-      </w:r>
-    </w:p>
-    <w:p>
-      <w:pPr>
-        <w:spacing w:after="0"/>
-      </w:pPr>
-      <w:r>
-        <w:t xml:space="preserve">    request_type VARCHAR(255) NOT NULL,</w:t>
-      </w:r>
-    </w:p>
-    <w:p>
-      <w:pPr>
-        <w:spacing w:after="0"/>
-      </w:pPr>
-      <w:r>
-        <w:t xml:space="preserve">    status ENUM('pending', 'accepted', 'completed', 'cancelled') DEFAULT 'pending',</w:t>
-      </w:r>
-    </w:p>
-    <w:p>
-      <w:pPr>
-        <w:spacing w:after="0"/>
-      </w:pPr>
-      <w:r>
-        <w:t xml:space="preserve">    latitude DECIMAL(10, 8),</w:t>
-      </w:r>
-    </w:p>
-    <w:p>
-      <w:pPr>
-        <w:spacing w:after="0"/>
-      </w:pPr>
-      <w:r>
-        <w:t xml:space="preserve">    longitude DECIMAL(11, 8),</w:t>
-      </w:r>
-    </w:p>
-    <w:p>
-      <w:pPr>
-        <w:spacing w:after="0"/>
-      </w:pPr>
-      <w:r>
-        <w:t xml:space="preserve">    created_at TIMESTAMP DEFAULT CURRENT_TIMESTAMP,</w:t>
-      </w:r>
-    </w:p>
-    <w:p>
-      <w:pPr>
-        <w:spacing w:after="0"/>
-      </w:pPr>
-      <w:r>
-        <w:t xml:space="preserve">    updated_at TIMESTAMP DEFAULT CURRENT_TIMESTAMP ON UPDATE CURRENT_TIMESTAMP,</w:t>
-      </w:r>
-    </w:p>
-    <w:p>
-      <w:pPr>
-        <w:spacing w:after="0"/>
-      </w:pPr>
-      <w:r>
-        <w:t xml:space="preserve">    FOREIGN KEY (requester_id) REFERENCES users(id),</w:t>
-      </w:r>
-    </w:p>
-    <w:p>
-      <w:pPr>
-        <w:spacing w:after="0"/>
-      </w:pPr>
-      <w:r>
-        <w:t xml:space="preserve">    FOREIGN KEY (helper_id) REFERENCES users(id) ON DELETE SET NULL</w:t>
+        <w:t xml:space="preserve">    </w:t>
+      </w:r>
+      <w:proofErr w:type="spellStart"/>
+      <w:r>
+        <w:t>requester_id</w:t>
+      </w:r>
+      <w:proofErr w:type="spellEnd"/>
+      <w:r>
+        <w:t xml:space="preserve"> INT NOT NULL,</w:t>
+      </w:r>
+    </w:p>
+    <w:p>
+      <w:pPr>
+        <w:spacing w:after="0"/>
+      </w:pPr>
+      <w:r>
+        <w:t xml:space="preserve">    </w:t>
+      </w:r>
+      <w:proofErr w:type="spellStart"/>
+      <w:r>
+        <w:t>helper_id</w:t>
+      </w:r>
+      <w:proofErr w:type="spellEnd"/>
+      <w:r>
+        <w:t xml:space="preserve"> INT DEFAULT NULL, </w:t>
+      </w:r>
+    </w:p>
+    <w:p>
+      <w:pPr>
+        <w:spacing w:after="0"/>
+      </w:pPr>
+      <w:r>
+        <w:t xml:space="preserve">    </w:t>
+      </w:r>
+      <w:proofErr w:type="spellStart"/>
+      <w:r>
+        <w:t>request_type</w:t>
+      </w:r>
+      <w:proofErr w:type="spellEnd"/>
+      <w:r>
+        <w:t xml:space="preserve"> </w:t>
+      </w:r>
+      <w:proofErr w:type="gramStart"/>
+      <w:r>
+        <w:t>VARCHAR(</w:t>
+      </w:r>
+      <w:proofErr w:type="gramEnd"/>
+      <w:r>
+        <w:t>255) NOT NULL,</w:t>
+      </w:r>
+    </w:p>
+    <w:p>
+      <w:pPr>
+        <w:spacing w:after="0"/>
+      </w:pPr>
+      <w:r>
+        <w:t xml:space="preserve">    status </w:t>
+      </w:r>
+      <w:proofErr w:type="gramStart"/>
+      <w:r>
+        <w:t>ENUM(</w:t>
+      </w:r>
+      <w:proofErr w:type="gramEnd"/>
+      <w:r>
+        <w:t>'pending', 'accepted', 'completed', 'cancelled') DEFAULT 'pending',</w:t>
+      </w:r>
+    </w:p>
+    <w:p>
+      <w:pPr>
+        <w:spacing w:after="0"/>
+      </w:pPr>
+      <w:r>
+        <w:t xml:space="preserve">    latitude </w:t>
+      </w:r>
+      <w:proofErr w:type="gramStart"/>
+      <w:r>
+        <w:t>DECIMAL(</w:t>
+      </w:r>
+      <w:proofErr w:type="gramEnd"/>
+      <w:r>
+        <w:t>10, 8),</w:t>
+      </w:r>
+    </w:p>
+    <w:p>
+      <w:pPr>
+        <w:spacing w:after="0"/>
+      </w:pPr>
+      <w:r>
+        <w:t xml:space="preserve">    longitude </w:t>
+      </w:r>
+      <w:proofErr w:type="gramStart"/>
+      <w:r>
+        <w:t>DECIMAL(</w:t>
+      </w:r>
+      <w:proofErr w:type="gramEnd"/>
+      <w:r>
+        <w:t>11, 8),</w:t>
+      </w:r>
+    </w:p>
+    <w:p>
+      <w:pPr>
+        <w:spacing w:after="0"/>
+      </w:pPr>
+      <w:r>
+        <w:t xml:space="preserve">    </w:t>
+      </w:r>
+      <w:proofErr w:type="spellStart"/>
+      <w:r>
+        <w:t>created_at</w:t>
+      </w:r>
+      <w:proofErr w:type="spellEnd"/>
+      <w:r>
+        <w:t xml:space="preserve"> TIMESTAMP DEFAULT CURRENT_TIMESTAMP,</w:t>
+      </w:r>
+    </w:p>
+    <w:p>
+      <w:pPr>
+        <w:spacing w:after="0"/>
+      </w:pPr>
+      <w:r>
+        <w:t xml:space="preserve">    </w:t>
+      </w:r>
+      <w:proofErr w:type="spellStart"/>
+      <w:r>
+        <w:t>updated_at</w:t>
+      </w:r>
+      <w:proofErr w:type="spellEnd"/>
+      <w:r>
+        <w:t xml:space="preserve"> TIMESTAMP DEFAULT CURRENT_TIMESTAMP ON UPDATE CURRENT_TIMESTAMP,</w:t>
+      </w:r>
+    </w:p>
+    <w:p>
+      <w:pPr>
+        <w:spacing w:after="0"/>
+      </w:pPr>
+      <w:r>
+        <w:t xml:space="preserve">    FOREIGN KEY (</w:t>
+      </w:r>
+      <w:proofErr w:type="spellStart"/>
+      <w:r>
+        <w:t>requester_id</w:t>
+      </w:r>
+      <w:proofErr w:type="spellEnd"/>
+      <w:r>
+        <w:t>) REFERENCES users(id),</w:t>
+      </w:r>
+    </w:p>
+    <w:p>
+      <w:pPr>
+        <w:spacing w:after="0"/>
+      </w:pPr>
+      <w:r>
+        <w:t xml:space="preserve">    FOREIGN KEY (</w:t>
+      </w:r>
+      <w:proofErr w:type="spellStart"/>
+      <w:r>
+        <w:t>helper_id</w:t>
+      </w:r>
+      <w:proofErr w:type="spellEnd"/>
+      <w:r>
+        <w:t>) REFERENCES users(id) ON DELETE SET NULL</w:t>
       </w:r>
     </w:p>
     <w:p>
@@ -6383,17 +7245,21 @@
       <w:pPr>
         <w:spacing w:after="0"/>
       </w:pPr>
+      <w:proofErr w:type="spellStart"/>
       <w:r>
         <w:t>sql</w:t>
       </w:r>
-    </w:p>
-    <w:p>
-      <w:pPr>
-        <w:spacing w:after="0"/>
-      </w:pPr>
+      <w:proofErr w:type="spellEnd"/>
+    </w:p>
+    <w:p>
+      <w:pPr>
+        <w:spacing w:after="0"/>
+      </w:pPr>
+      <w:proofErr w:type="spellStart"/>
       <w:r>
         <w:t>CopyEdit</w:t>
       </w:r>
+      <w:proofErr w:type="spellEnd"/>
     </w:p>
     <w:p>
       <w:pPr>
@@ -6416,15 +7282,31 @@
         <w:spacing w:after="0"/>
       </w:pPr>
       <w:r>
-        <w:t xml:space="preserve">    request_id INT NOT NULL,</w:t>
-      </w:r>
-    </w:p>
-    <w:p>
-      <w:pPr>
-        <w:spacing w:after="0"/>
-      </w:pPr>
-      <w:r>
-        <w:t xml:space="preserve">    sender_id INT NOT NULL,</w:t>
+        <w:t xml:space="preserve">    </w:t>
+      </w:r>
+      <w:proofErr w:type="spellStart"/>
+      <w:r>
+        <w:t>request_id</w:t>
+      </w:r>
+      <w:proofErr w:type="spellEnd"/>
+      <w:r>
+        <w:t xml:space="preserve"> INT NOT NULL,</w:t>
+      </w:r>
+    </w:p>
+    <w:p>
+      <w:pPr>
+        <w:spacing w:after="0"/>
+      </w:pPr>
+      <w:r>
+        <w:t xml:space="preserve">    </w:t>
+      </w:r>
+      <w:proofErr w:type="spellStart"/>
+      <w:r>
+        <w:t>sender_id</w:t>
+      </w:r>
+      <w:proofErr w:type="spellEnd"/>
+      <w:r>
+        <w:t xml:space="preserve"> INT NOT NULL,</w:t>
       </w:r>
     </w:p>
     <w:p>
@@ -6440,23 +7322,47 @@
         <w:spacing w:after="0"/>
       </w:pPr>
       <w:r>
-        <w:t xml:space="preserve">    timestamp TIMESTAMP DEFAULT CURRENT_TIMESTAMP,</w:t>
-      </w:r>
-    </w:p>
-    <w:p>
-      <w:pPr>
-        <w:spacing w:after="0"/>
-      </w:pPr>
-      <w:r>
-        <w:t xml:space="preserve">    FOREIGN KEY (request_id) REFERENCES requests(id),</w:t>
-      </w:r>
-    </w:p>
-    <w:p>
-      <w:pPr>
-        <w:spacing w:after="0"/>
-      </w:pPr>
-      <w:r>
-        <w:t xml:space="preserve">    FOREIGN KEY (sender_id) REFERENCES users(id)</w:t>
+        <w:t xml:space="preserve">    timestamp </w:t>
+      </w:r>
+      <w:proofErr w:type="spellStart"/>
+      <w:r>
+        <w:t>TIMESTAMP</w:t>
+      </w:r>
+      <w:proofErr w:type="spellEnd"/>
+      <w:r>
+        <w:t xml:space="preserve"> DEFAULT CURRENT_TIMESTAMP,</w:t>
+      </w:r>
+    </w:p>
+    <w:p>
+      <w:pPr>
+        <w:spacing w:after="0"/>
+      </w:pPr>
+      <w:r>
+        <w:t xml:space="preserve">    FOREIGN KEY (</w:t>
+      </w:r>
+      <w:proofErr w:type="spellStart"/>
+      <w:r>
+        <w:t>request_id</w:t>
+      </w:r>
+      <w:proofErr w:type="spellEnd"/>
+      <w:r>
+        <w:t>) REFERENCES requests(id),</w:t>
+      </w:r>
+    </w:p>
+    <w:p>
+      <w:pPr>
+        <w:spacing w:after="0"/>
+      </w:pPr>
+      <w:r>
+        <w:t xml:space="preserve">    FOREIGN KEY (</w:t>
+      </w:r>
+      <w:proofErr w:type="spellStart"/>
+      <w:r>
+        <w:t>sender_id</w:t>
+      </w:r>
+      <w:proofErr w:type="spellEnd"/>
+      <w:r>
+        <w:t>) REFERENCES users(id)</w:t>
       </w:r>
     </w:p>
     <w:p>
@@ -6487,17 +7393,21 @@
       <w:pPr>
         <w:spacing w:after="0"/>
       </w:pPr>
+      <w:proofErr w:type="spellStart"/>
       <w:r>
         <w:t>sql</w:t>
       </w:r>
-    </w:p>
-    <w:p>
-      <w:pPr>
-        <w:spacing w:after="0"/>
-      </w:pPr>
+      <w:proofErr w:type="spellEnd"/>
+    </w:p>
+    <w:p>
+      <w:pPr>
+        <w:spacing w:after="0"/>
+      </w:pPr>
+      <w:proofErr w:type="spellStart"/>
       <w:r>
         <w:t>CopyEdit</w:t>
       </w:r>
+      <w:proofErr w:type="spellEnd"/>
     </w:p>
     <w:p>
       <w:pPr>
@@ -6520,15 +7430,31 @@
         <w:spacing w:after="0"/>
       </w:pPr>
       <w:r>
-        <w:t xml:space="preserve">    reviewer_id INT NOT NULL,</w:t>
-      </w:r>
-    </w:p>
-    <w:p>
-      <w:pPr>
-        <w:spacing w:after="0"/>
-      </w:pPr>
-      <w:r>
-        <w:t xml:space="preserve">    reviewed_user_id INT NOT NULL,</w:t>
+        <w:t xml:space="preserve">    </w:t>
+      </w:r>
+      <w:proofErr w:type="spellStart"/>
+      <w:r>
+        <w:t>reviewer_id</w:t>
+      </w:r>
+      <w:proofErr w:type="spellEnd"/>
+      <w:r>
+        <w:t xml:space="preserve"> INT NOT NULL,</w:t>
+      </w:r>
+    </w:p>
+    <w:p>
+      <w:pPr>
+        <w:spacing w:after="0"/>
+      </w:pPr>
+      <w:r>
+        <w:t xml:space="preserve">    </w:t>
+      </w:r>
+      <w:proofErr w:type="spellStart"/>
+      <w:r>
+        <w:t>reviewed_user_id</w:t>
+      </w:r>
+      <w:proofErr w:type="spellEnd"/>
+      <w:r>
+        <w:t xml:space="preserve"> INT NOT NULL,</w:t>
       </w:r>
     </w:p>
     <w:p>
@@ -6552,23 +7478,47 @@
         <w:spacing w:after="0"/>
       </w:pPr>
       <w:r>
-        <w:t xml:space="preserve">    created_at TIMESTAMP DEFAULT CURRENT_TIMESTAMP,</w:t>
-      </w:r>
-    </w:p>
-    <w:p>
-      <w:pPr>
-        <w:spacing w:after="0"/>
-      </w:pPr>
-      <w:r>
-        <w:t xml:space="preserve">    FOREIGN KEY (reviewer_id) REFERENCES users(id),</w:t>
-      </w:r>
-    </w:p>
-    <w:p>
-      <w:pPr>
-        <w:spacing w:after="0"/>
-      </w:pPr>
-      <w:r>
-        <w:t xml:space="preserve">    FOREIGN KEY (reviewed_user_id) REFERENCES users(id)</w:t>
+        <w:t xml:space="preserve">    </w:t>
+      </w:r>
+      <w:proofErr w:type="spellStart"/>
+      <w:r>
+        <w:t>created_at</w:t>
+      </w:r>
+      <w:proofErr w:type="spellEnd"/>
+      <w:r>
+        <w:t xml:space="preserve"> TIMESTAMP DEFAULT CURRENT_TIMESTAMP,</w:t>
+      </w:r>
+    </w:p>
+    <w:p>
+      <w:pPr>
+        <w:spacing w:after="0"/>
+      </w:pPr>
+      <w:r>
+        <w:t xml:space="preserve">    FOREIGN KEY (</w:t>
+      </w:r>
+      <w:proofErr w:type="spellStart"/>
+      <w:r>
+        <w:t>reviewer_id</w:t>
+      </w:r>
+      <w:proofErr w:type="spellEnd"/>
+      <w:r>
+        <w:t>) REFERENCES users(id),</w:t>
+      </w:r>
+    </w:p>
+    <w:p>
+      <w:pPr>
+        <w:spacing w:after="0"/>
+      </w:pPr>
+      <w:r>
+        <w:t xml:space="preserve">    FOREIGN KEY (</w:t>
+      </w:r>
+      <w:proofErr w:type="spellStart"/>
+      <w:r>
+        <w:t>reviewed_user_id</w:t>
+      </w:r>
+      <w:proofErr w:type="spellEnd"/>
+      <w:r>
+        <w:t>) REFERENCES users(id)</w:t>
       </w:r>
     </w:p>
     <w:p>
@@ -6633,25 +7583,34 @@
       <w:pPr>
         <w:spacing w:after="0"/>
       </w:pPr>
+      <w:proofErr w:type="spellStart"/>
       <w:r>
         <w:t>sql</w:t>
       </w:r>
-    </w:p>
-    <w:p>
-      <w:pPr>
-        <w:spacing w:after="0"/>
-      </w:pPr>
+      <w:proofErr w:type="spellEnd"/>
+    </w:p>
+    <w:p>
+      <w:pPr>
+        <w:spacing w:after="0"/>
+      </w:pPr>
+      <w:proofErr w:type="spellStart"/>
       <w:r>
         <w:t>CopyEdit</w:t>
       </w:r>
-    </w:p>
-    <w:p>
-      <w:pPr>
-        <w:spacing w:after="0"/>
-      </w:pPr>
-      <w:r>
-        <w:t>SHOW TABLES;</w:t>
-      </w:r>
+      <w:proofErr w:type="spellEnd"/>
+    </w:p>
+    <w:p>
+      <w:pPr>
+        <w:spacing w:after="0"/>
+      </w:pPr>
+      <w:r>
+        <w:t xml:space="preserve">SHOW </w:t>
+      </w:r>
+      <w:proofErr w:type="gramStart"/>
+      <w:r>
+        <w:t>TABLES;</w:t>
+      </w:r>
+      <w:proofErr w:type="gramEnd"/>
     </w:p>
     <w:p>
       <w:pPr>
@@ -6735,223 +7694,449 @@
           <w:b/>
           <w:bCs/>
         </w:rPr>
-        <w:t>4️</w:t>
-      </w:r>
-      <w:r>
-        <w:rPr>
-          <w:rFonts w:ascii="Segoe UI Symbol" w:hAnsi="Segoe UI Symbol" w:cs="Segoe UI Symbol"/>
-          <w:b/>
-          <w:bCs/>
-        </w:rPr>
-        <w:t>⃣</w:t>
-      </w:r>
-      <w:r>
-        <w:rPr>
-          <w:b/>
-          <w:bCs/>
-        </w:rPr>
-        <w:t xml:space="preserve"> Update Your Node.js Database Connection</w:t>
-      </w:r>
-    </w:p>
-    <w:p>
-      <w:pPr>
-        <w:spacing w:after="0"/>
-      </w:pPr>
-      <w:r>
-        <w:t>If you changed the database name, update your db.js file:</w:t>
-      </w:r>
-    </w:p>
-    <w:p>
-      <w:pPr>
-        <w:spacing w:after="0"/>
-      </w:pPr>
-      <w:r>
-        <w:t>js</w:t>
-      </w:r>
-    </w:p>
-    <w:p>
-      <w:pPr>
-        <w:spacing w:after="0"/>
-      </w:pPr>
+        <w:t>1. Using Git Bash for Project Setup &amp; Git Operations</w:t>
+      </w:r>
+    </w:p>
+    <w:p>
+      <w:pPr>
+        <w:spacing w:after="0"/>
+      </w:pPr>
+      <w:r>
+        <w:t xml:space="preserve">You can use </w:t>
+      </w:r>
+      <w:r>
+        <w:rPr>
+          <w:b/>
+          <w:bCs/>
+        </w:rPr>
+        <w:t>Git Bash</w:t>
+      </w:r>
+      <w:r>
+        <w:t xml:space="preserve"> for the following tasks:</w:t>
+      </w:r>
+    </w:p>
+    <w:p>
+      <w:pPr>
+        <w:numPr>
+          <w:ilvl w:val="0"/>
+          <w:numId w:val="42"/>
+        </w:numPr>
+        <w:spacing w:after="0"/>
+      </w:pPr>
+      <w:r>
+        <w:rPr>
+          <w:b/>
+          <w:bCs/>
+        </w:rPr>
+        <w:t>Initialize Git repository (if not done already)</w:t>
+      </w:r>
+      <w:r>
+        <w:t>:</w:t>
+      </w:r>
+    </w:p>
+    <w:p>
+      <w:pPr>
+        <w:spacing w:after="0"/>
+      </w:pPr>
+      <w:r>
+        <w:t>bash</w:t>
+      </w:r>
+    </w:p>
+    <w:p>
+      <w:pPr>
+        <w:spacing w:after="0"/>
+      </w:pPr>
+      <w:proofErr w:type="spellStart"/>
       <w:r>
         <w:t>CopyEdit</w:t>
       </w:r>
-    </w:p>
-    <w:p>
-      <w:pPr>
-        <w:spacing w:after="0"/>
-      </w:pPr>
-      <w:r>
-        <w:t>const mysql = require('mysql2');</w:t>
-      </w:r>
-    </w:p>
-    <w:p>
-      <w:pPr>
-        <w:spacing w:after="0"/>
-      </w:pPr>
-      <w:r>
-        <w:t>const pool = mysql.createPool({</w:t>
-      </w:r>
-    </w:p>
-    <w:p>
-      <w:pPr>
-        <w:spacing w:after="0"/>
-      </w:pPr>
-      <w:r>
-        <w:t xml:space="preserve">    host: 'localhost',</w:t>
-      </w:r>
-    </w:p>
-    <w:p>
-      <w:pPr>
-        <w:spacing w:after="0"/>
-      </w:pPr>
-      <w:r>
-        <w:t xml:space="preserve">    user: 'your_username',</w:t>
-      </w:r>
-    </w:p>
-    <w:p>
-      <w:pPr>
-        <w:spacing w:after="0"/>
-      </w:pPr>
-      <w:r>
-        <w:t xml:space="preserve">    password: 'your_password',</w:t>
-      </w:r>
-    </w:p>
-    <w:p>
-      <w:pPr>
-        <w:spacing w:after="0"/>
-      </w:pPr>
-      <w:r>
-        <w:t xml:space="preserve">    database: 'air_assist_db',  // Update to your new DB name</w:t>
-      </w:r>
-    </w:p>
-    <w:p>
-      <w:pPr>
-        <w:spacing w:after="0"/>
-      </w:pPr>
-      <w:r>
-        <w:t xml:space="preserve">    waitForConnections: true,</w:t>
-      </w:r>
-    </w:p>
-    <w:p>
-      <w:pPr>
-        <w:spacing w:after="0"/>
-      </w:pPr>
-      <w:r>
-        <w:t xml:space="preserve">    connectionLimit: 10,</w:t>
-      </w:r>
-    </w:p>
-    <w:p>
-      <w:pPr>
-        <w:spacing w:after="0"/>
-      </w:pPr>
-      <w:r>
-        <w:t xml:space="preserve">    queueLimit: 0</w:t>
-      </w:r>
-    </w:p>
-    <w:p>
-      <w:pPr>
-        <w:spacing w:after="0"/>
-      </w:pPr>
-      <w:r>
-        <w:t>});</w:t>
-      </w:r>
-    </w:p>
-    <w:p>
-      <w:pPr>
-        <w:spacing w:after="0"/>
-      </w:pPr>
-    </w:p>
-    <w:p>
-      <w:pPr>
-        <w:spacing w:after="0"/>
-      </w:pPr>
-      <w:r>
-        <w:t>module.exports = pool.promise();</w:t>
-      </w:r>
-    </w:p>
-    <w:p>
-      <w:pPr>
-        <w:spacing w:after="0"/>
-      </w:pPr>
-      <w:r>
-        <w:pict w14:anchorId="3361FBA0">
-          <v:rect id="_x0000_i1847" style="width:0;height:1.5pt" o:hralign="center" o:hrstd="t" o:hr="t" fillcolor="#a0a0a0" stroked="f"/>
-        </w:pict>
-      </w:r>
-    </w:p>
-    <w:p>
-      <w:pPr>
-        <w:spacing w:after="0"/>
-      </w:pPr>
-      <w:r>
-        <w:rPr>
-          <w:rFonts w:ascii="Segoe UI Emoji" w:hAnsi="Segoe UI Emoji" w:cs="Segoe UI Emoji"/>
-        </w:rPr>
-        <w:t>✅</w:t>
-      </w:r>
-      <w:r>
-        <w:t xml:space="preserve"> </w:t>
-      </w:r>
-      <w:r>
-        <w:rPr>
-          <w:b/>
-          <w:bCs/>
-        </w:rPr>
-        <w:t>Next Steps</w:t>
+      <w:proofErr w:type="spellEnd"/>
+    </w:p>
+    <w:p>
+      <w:pPr>
+        <w:spacing w:after="0"/>
+      </w:pPr>
+      <w:r>
+        <w:t xml:space="preserve">git </w:t>
+      </w:r>
+      <w:proofErr w:type="spellStart"/>
+      <w:r>
+        <w:t>init</w:t>
+      </w:r>
+      <w:proofErr w:type="spellEnd"/>
+    </w:p>
+    <w:p>
+      <w:pPr>
+        <w:numPr>
+          <w:ilvl w:val="0"/>
+          <w:numId w:val="42"/>
+        </w:numPr>
+        <w:spacing w:after="0"/>
+      </w:pPr>
+      <w:r>
+        <w:rPr>
+          <w:b/>
+          <w:bCs/>
+        </w:rPr>
+        <w:t>Install dependencies</w:t>
+      </w:r>
+      <w:r>
+        <w:t>: Inside your project folder (using Git Bash), run:</w:t>
+      </w:r>
+    </w:p>
+    <w:p>
+      <w:pPr>
+        <w:spacing w:after="0"/>
+      </w:pPr>
+      <w:r>
+        <w:t>bash</w:t>
+      </w:r>
+    </w:p>
+    <w:p>
+      <w:pPr>
+        <w:spacing w:after="0"/>
+      </w:pPr>
+      <w:proofErr w:type="spellStart"/>
+      <w:r>
+        <w:t>CopyEdit</w:t>
+      </w:r>
+      <w:proofErr w:type="spellEnd"/>
+    </w:p>
+    <w:p>
+      <w:pPr>
+        <w:spacing w:after="0"/>
+      </w:pPr>
+      <w:proofErr w:type="spellStart"/>
+      <w:proofErr w:type="gramStart"/>
+      <w:r>
+        <w:t>npm</w:t>
+      </w:r>
+      <w:proofErr w:type="spellEnd"/>
+      <w:r>
+        <w:t xml:space="preserve"> install</w:t>
+      </w:r>
+      <w:proofErr w:type="gramEnd"/>
+      <w:r>
+        <w:t xml:space="preserve"> mysql2</w:t>
+      </w:r>
+    </w:p>
+    <w:p>
+      <w:pPr>
+        <w:numPr>
+          <w:ilvl w:val="0"/>
+          <w:numId w:val="42"/>
+        </w:numPr>
+        <w:spacing w:after="0"/>
+      </w:pPr>
+      <w:r>
+        <w:rPr>
+          <w:b/>
+          <w:bCs/>
+        </w:rPr>
+        <w:t>Commit and push to GitHub</w:t>
       </w:r>
       <w:r>
         <w:t>:</w:t>
       </w:r>
-      <w:r>
-        <w:br/>
-      </w:r>
-      <w:r>
-        <w:rPr>
-          <w:rFonts w:ascii="Segoe UI Emoji" w:hAnsi="Segoe UI Emoji" w:cs="Segoe UI Emoji"/>
-        </w:rPr>
-        <w:t>🔹</w:t>
-      </w:r>
-      <w:r>
-        <w:t xml:space="preserve"> Do you want help with </w:t>
-      </w:r>
-      <w:r>
-        <w:rPr>
-          <w:b/>
-          <w:bCs/>
-        </w:rPr>
-        <w:t>inserting sample data</w:t>
-      </w:r>
-      <w:r>
-        <w:t xml:space="preserve"> into the tables?</w:t>
-      </w:r>
-      <w:r>
-        <w:br/>
-      </w:r>
-      <w:r>
-        <w:rPr>
-          <w:rFonts w:ascii="Segoe UI Emoji" w:hAnsi="Segoe UI Emoji" w:cs="Segoe UI Emoji"/>
-        </w:rPr>
-        <w:t>🔹</w:t>
-      </w:r>
-      <w:r>
-        <w:t xml:space="preserve"> Or should we start working on </w:t>
-      </w:r>
-      <w:r>
-        <w:rPr>
-          <w:b/>
-          <w:bCs/>
-        </w:rPr>
-        <w:t>API endpoints</w:t>
-      </w:r>
-      <w:r>
-        <w:t xml:space="preserve"> for authentication and requests?</w:t>
-      </w:r>
-    </w:p>
-    <w:p>
-      <w:pPr>
-        <w:spacing w:after="0"/>
-      </w:pPr>
+    </w:p>
+    <w:p>
+      <w:pPr>
+        <w:spacing w:after="0"/>
+      </w:pPr>
+      <w:r>
+        <w:t>bash</w:t>
+      </w:r>
+    </w:p>
+    <w:p>
+      <w:pPr>
+        <w:spacing w:after="0"/>
+      </w:pPr>
+      <w:proofErr w:type="spellStart"/>
+      <w:r>
+        <w:t>CopyEdit</w:t>
+      </w:r>
+      <w:proofErr w:type="spellEnd"/>
+    </w:p>
+    <w:p>
+      <w:pPr>
+        <w:spacing w:after="0"/>
+      </w:pPr>
+      <w:r>
+        <w:t xml:space="preserve">git </w:t>
+      </w:r>
+      <w:proofErr w:type="gramStart"/>
+      <w:r>
+        <w:t>add .</w:t>
+      </w:r>
+      <w:proofErr w:type="gramEnd"/>
+    </w:p>
+    <w:p>
+      <w:pPr>
+        <w:spacing w:after="0"/>
+      </w:pPr>
+      <w:r>
+        <w:t>git commit -m "Initial commit with db.js"</w:t>
+      </w:r>
+    </w:p>
+    <w:p>
+      <w:pPr>
+        <w:spacing w:after="0"/>
+      </w:pPr>
+      <w:r>
+        <w:t>git push origin main</w:t>
+      </w:r>
+    </w:p>
+    <w:p>
+      <w:pPr>
+        <w:numPr>
+          <w:ilvl w:val="0"/>
+          <w:numId w:val="42"/>
+        </w:numPr>
+        <w:spacing w:after="0"/>
+      </w:pPr>
+      <w:r>
+        <w:rPr>
+          <w:b/>
+          <w:bCs/>
+        </w:rPr>
+        <w:t>Start your Node.js server</w:t>
+      </w:r>
+      <w:r>
+        <w:t>:</w:t>
+      </w:r>
+    </w:p>
+    <w:p>
+      <w:pPr>
+        <w:spacing w:after="0"/>
+      </w:pPr>
+      <w:r>
+        <w:t>bash</w:t>
+      </w:r>
+    </w:p>
+    <w:p>
+      <w:pPr>
+        <w:spacing w:after="0"/>
+      </w:pPr>
+      <w:proofErr w:type="spellStart"/>
+      <w:r>
+        <w:t>CopyEdit</w:t>
+      </w:r>
+      <w:proofErr w:type="spellEnd"/>
+    </w:p>
+    <w:p>
+      <w:pPr>
+        <w:spacing w:after="0"/>
+      </w:pPr>
+      <w:r>
+        <w:t>node server.js</w:t>
+      </w:r>
+    </w:p>
+    <w:p>
+      <w:pPr>
+        <w:spacing w:after="0"/>
+      </w:pPr>
+      <w:r>
+        <w:lastRenderedPageBreak/>
+        <w:drawing>
+          <wp:inline distT="0" distB="0" distL="0" distR="0" wp14:anchorId="0D67CE33" wp14:editId="5310A163">
+            <wp:extent cx="6858000" cy="3371850"/>
+            <wp:effectExtent l="0" t="0" r="0" b="0"/>
+            <wp:docPr id="1567432365" name="Picture 1" descr="A screenshot of a computer program&#10;&#10;AI-generated content may be incorrect."/>
+            <wp:cNvGraphicFramePr>
+              <a:graphicFrameLocks xmlns:a="http://schemas.openxmlformats.org/drawingml/2006/main" noChangeAspect="1"/>
+            </wp:cNvGraphicFramePr>
+            <a:graphic xmlns:a="http://schemas.openxmlformats.org/drawingml/2006/main">
+              <a:graphicData uri="http://schemas.openxmlformats.org/drawingml/2006/picture">
+                <pic:pic xmlns:pic="http://schemas.openxmlformats.org/drawingml/2006/picture">
+                  <pic:nvPicPr>
+                    <pic:cNvPr id="1567432365" name="Picture 1" descr="A screenshot of a computer program&#10;&#10;AI-generated content may be incorrect."/>
+                    <pic:cNvPicPr/>
+                  </pic:nvPicPr>
+                  <pic:blipFill>
+                    <a:blip r:embed="rId51"/>
+                    <a:stretch>
+                      <a:fillRect/>
+                    </a:stretch>
+                  </pic:blipFill>
+                  <pic:spPr>
+                    <a:xfrm>
+                      <a:off x="0" y="0"/>
+                      <a:ext cx="6858000" cy="3371850"/>
+                    </a:xfrm>
+                    <a:prstGeom prst="rect">
+                      <a:avLst/>
+                    </a:prstGeom>
+                  </pic:spPr>
+                </pic:pic>
+              </a:graphicData>
+            </a:graphic>
+          </wp:inline>
+        </w:drawing>
+      </w:r>
+    </w:p>
+    <w:p>
+      <w:pPr>
+        <w:spacing w:after="0"/>
+      </w:pPr>
+      <w:r>
+        <w:drawing>
+          <wp:inline distT="0" distB="0" distL="0" distR="0" wp14:anchorId="58DA7D76" wp14:editId="550D5E5A">
+            <wp:extent cx="4176122" cy="929721"/>
+            <wp:effectExtent l="0" t="0" r="0" b="3810"/>
+            <wp:docPr id="1072075319" name="Picture 1" descr="A screenshot of a computer&#10;&#10;AI-generated content may be incorrect."/>
+            <wp:cNvGraphicFramePr>
+              <a:graphicFrameLocks xmlns:a="http://schemas.openxmlformats.org/drawingml/2006/main" noChangeAspect="1"/>
+            </wp:cNvGraphicFramePr>
+            <a:graphic xmlns:a="http://schemas.openxmlformats.org/drawingml/2006/main">
+              <a:graphicData uri="http://schemas.openxmlformats.org/drawingml/2006/picture">
+                <pic:pic xmlns:pic="http://schemas.openxmlformats.org/drawingml/2006/picture">
+                  <pic:nvPicPr>
+                    <pic:cNvPr id="1072075319" name="Picture 1" descr="A screenshot of a computer&#10;&#10;AI-generated content may be incorrect."/>
+                    <pic:cNvPicPr/>
+                  </pic:nvPicPr>
+                  <pic:blipFill>
+                    <a:blip r:embed="rId52"/>
+                    <a:stretch>
+                      <a:fillRect/>
+                    </a:stretch>
+                  </pic:blipFill>
+                  <pic:spPr>
+                    <a:xfrm>
+                      <a:off x="0" y="0"/>
+                      <a:ext cx="4176122" cy="929721"/>
+                    </a:xfrm>
+                    <a:prstGeom prst="rect">
+                      <a:avLst/>
+                    </a:prstGeom>
+                  </pic:spPr>
+                </pic:pic>
+              </a:graphicData>
+            </a:graphic>
+          </wp:inline>
+        </w:drawing>
+      </w:r>
+    </w:p>
+    <w:p>
+      <w:pPr>
+        <w:spacing w:after="0"/>
+      </w:pPr>
+      <w:r>
+        <w:rPr>
+          <w:highlight w:val="yellow"/>
+        </w:rPr>
+        <w:t>3/17/2025</w:t>
+      </w:r>
+    </w:p>
+    <w:p>
+      <w:pPr>
+        <w:spacing w:after="0"/>
+        <w:rPr>
+          <w:b/>
+          <w:bCs/>
+        </w:rPr>
+      </w:pPr>
+      <w:r>
+        <w:rPr>
+          <w:b/>
+          <w:bCs/>
+        </w:rPr>
+        <w:t>To Do Next:</w:t>
+      </w:r>
+    </w:p>
+    <w:p>
+      <w:pPr>
+        <w:numPr>
+          <w:ilvl w:val="0"/>
+          <w:numId w:val="47"/>
+        </w:numPr>
+        <w:spacing w:after="0"/>
+      </w:pPr>
+      <w:r>
+        <w:rPr>
+          <w:b/>
+          <w:bCs/>
+        </w:rPr>
+        <w:t>Database Integration</w:t>
+      </w:r>
+      <w:r>
+        <w:t xml:space="preserve">: Once your database connection is working, you can start adding specific routes to handle your app's data, like: </w:t>
+      </w:r>
+    </w:p>
+    <w:p>
+      <w:pPr>
+        <w:numPr>
+          <w:ilvl w:val="1"/>
+          <w:numId w:val="47"/>
+        </w:numPr>
+        <w:spacing w:after="0"/>
+      </w:pPr>
+      <w:r>
+        <w:rPr>
+          <w:b/>
+          <w:bCs/>
+        </w:rPr>
+        <w:t>User registration</w:t>
+      </w:r>
+      <w:r>
+        <w:t xml:space="preserve"> (POST request to create users)</w:t>
+      </w:r>
+    </w:p>
+    <w:p>
+      <w:pPr>
+        <w:numPr>
+          <w:ilvl w:val="1"/>
+          <w:numId w:val="47"/>
+        </w:numPr>
+        <w:spacing w:after="0"/>
+      </w:pPr>
+      <w:r>
+        <w:rPr>
+          <w:b/>
+          <w:bCs/>
+        </w:rPr>
+        <w:t>Help request submission</w:t>
+      </w:r>
+      <w:r>
+        <w:t xml:space="preserve"> (POST request to create help requests)</w:t>
+      </w:r>
+    </w:p>
+    <w:p>
+      <w:pPr>
+        <w:numPr>
+          <w:ilvl w:val="1"/>
+          <w:numId w:val="47"/>
+        </w:numPr>
+        <w:spacing w:after="0"/>
+      </w:pPr>
+      <w:r>
+        <w:rPr>
+          <w:b/>
+          <w:bCs/>
+        </w:rPr>
+        <w:t>Fetch requests</w:t>
+      </w:r>
+      <w:r>
+        <w:t xml:space="preserve"> (GET request to fetch help requests)</w:t>
+      </w:r>
+    </w:p>
+    <w:p>
+      <w:pPr>
+        <w:numPr>
+          <w:ilvl w:val="0"/>
+          <w:numId w:val="47"/>
+        </w:numPr>
+        <w:spacing w:after="0"/>
+      </w:pPr>
+      <w:r>
+        <w:rPr>
+          <w:b/>
+          <w:bCs/>
+        </w:rPr>
+        <w:t>Testing</w:t>
+      </w:r>
+      <w:r>
+        <w:t>: Ensure that you're testing API routes using Postman or similar tools to verify that they interact correctly with the database.</w:t>
+      </w:r>
     </w:p>
     <w:p>
       <w:pPr>
@@ -7567,6 +8752,155 @@
     </w:lvl>
   </w:abstractNum>
   <w:abstractNum w:abstractNumId="4" w15:restartNumberingAfterBreak="0">
+    <w:nsid w:val="19075516"/>
+    <w:multiLevelType w:val="multilevel"/>
+    <w:tmpl w:val="E92CE5A0"/>
+    <w:lvl w:ilvl="0">
+      <w:start w:val="1"/>
+      <w:numFmt w:val="bullet"/>
+      <w:lvlText w:val=""/>
+      <w:lvlJc w:val="left"/>
+      <w:pPr>
+        <w:tabs>
+          <w:tab w:val="num" w:pos="720"/>
+        </w:tabs>
+        <w:ind w:left="720" w:hanging="360"/>
+      </w:pPr>
+      <w:rPr>
+        <w:rFonts w:ascii="Symbol" w:hAnsi="Symbol" w:hint="default"/>
+        <w:sz w:val="20"/>
+      </w:rPr>
+    </w:lvl>
+    <w:lvl w:ilvl="1" w:tentative="1">
+      <w:start w:val="1"/>
+      <w:numFmt w:val="bullet"/>
+      <w:lvlText w:val="o"/>
+      <w:lvlJc w:val="left"/>
+      <w:pPr>
+        <w:tabs>
+          <w:tab w:val="num" w:pos="1440"/>
+        </w:tabs>
+        <w:ind w:left="1440" w:hanging="360"/>
+      </w:pPr>
+      <w:rPr>
+        <w:rFonts w:ascii="Courier New" w:hAnsi="Courier New" w:hint="default"/>
+        <w:sz w:val="20"/>
+      </w:rPr>
+    </w:lvl>
+    <w:lvl w:ilvl="2" w:tentative="1">
+      <w:start w:val="1"/>
+      <w:numFmt w:val="bullet"/>
+      <w:lvlText w:val=""/>
+      <w:lvlJc w:val="left"/>
+      <w:pPr>
+        <w:tabs>
+          <w:tab w:val="num" w:pos="2160"/>
+        </w:tabs>
+        <w:ind w:left="2160" w:hanging="360"/>
+      </w:pPr>
+      <w:rPr>
+        <w:rFonts w:ascii="Wingdings" w:hAnsi="Wingdings" w:hint="default"/>
+        <w:sz w:val="20"/>
+      </w:rPr>
+    </w:lvl>
+    <w:lvl w:ilvl="3" w:tentative="1">
+      <w:start w:val="1"/>
+      <w:numFmt w:val="bullet"/>
+      <w:lvlText w:val=""/>
+      <w:lvlJc w:val="left"/>
+      <w:pPr>
+        <w:tabs>
+          <w:tab w:val="num" w:pos="2880"/>
+        </w:tabs>
+        <w:ind w:left="2880" w:hanging="360"/>
+      </w:pPr>
+      <w:rPr>
+        <w:rFonts w:ascii="Wingdings" w:hAnsi="Wingdings" w:hint="default"/>
+        <w:sz w:val="20"/>
+      </w:rPr>
+    </w:lvl>
+    <w:lvl w:ilvl="4" w:tentative="1">
+      <w:start w:val="1"/>
+      <w:numFmt w:val="bullet"/>
+      <w:lvlText w:val=""/>
+      <w:lvlJc w:val="left"/>
+      <w:pPr>
+        <w:tabs>
+          <w:tab w:val="num" w:pos="3600"/>
+        </w:tabs>
+        <w:ind w:left="3600" w:hanging="360"/>
+      </w:pPr>
+      <w:rPr>
+        <w:rFonts w:ascii="Wingdings" w:hAnsi="Wingdings" w:hint="default"/>
+        <w:sz w:val="20"/>
+      </w:rPr>
+    </w:lvl>
+    <w:lvl w:ilvl="5" w:tentative="1">
+      <w:start w:val="1"/>
+      <w:numFmt w:val="bullet"/>
+      <w:lvlText w:val=""/>
+      <w:lvlJc w:val="left"/>
+      <w:pPr>
+        <w:tabs>
+          <w:tab w:val="num" w:pos="4320"/>
+        </w:tabs>
+        <w:ind w:left="4320" w:hanging="360"/>
+      </w:pPr>
+      <w:rPr>
+        <w:rFonts w:ascii="Wingdings" w:hAnsi="Wingdings" w:hint="default"/>
+        <w:sz w:val="20"/>
+      </w:rPr>
+    </w:lvl>
+    <w:lvl w:ilvl="6" w:tentative="1">
+      <w:start w:val="1"/>
+      <w:numFmt w:val="bullet"/>
+      <w:lvlText w:val=""/>
+      <w:lvlJc w:val="left"/>
+      <w:pPr>
+        <w:tabs>
+          <w:tab w:val="num" w:pos="5040"/>
+        </w:tabs>
+        <w:ind w:left="5040" w:hanging="360"/>
+      </w:pPr>
+      <w:rPr>
+        <w:rFonts w:ascii="Wingdings" w:hAnsi="Wingdings" w:hint="default"/>
+        <w:sz w:val="20"/>
+      </w:rPr>
+    </w:lvl>
+    <w:lvl w:ilvl="7" w:tentative="1">
+      <w:start w:val="1"/>
+      <w:numFmt w:val="bullet"/>
+      <w:lvlText w:val=""/>
+      <w:lvlJc w:val="left"/>
+      <w:pPr>
+        <w:tabs>
+          <w:tab w:val="num" w:pos="5760"/>
+        </w:tabs>
+        <w:ind w:left="5760" w:hanging="360"/>
+      </w:pPr>
+      <w:rPr>
+        <w:rFonts w:ascii="Wingdings" w:hAnsi="Wingdings" w:hint="default"/>
+        <w:sz w:val="20"/>
+      </w:rPr>
+    </w:lvl>
+    <w:lvl w:ilvl="8" w:tentative="1">
+      <w:start w:val="1"/>
+      <w:numFmt w:val="bullet"/>
+      <w:lvlText w:val=""/>
+      <w:lvlJc w:val="left"/>
+      <w:pPr>
+        <w:tabs>
+          <w:tab w:val="num" w:pos="6480"/>
+        </w:tabs>
+        <w:ind w:left="6480" w:hanging="360"/>
+      </w:pPr>
+      <w:rPr>
+        <w:rFonts w:ascii="Wingdings" w:hAnsi="Wingdings" w:hint="default"/>
+        <w:sz w:val="20"/>
+      </w:rPr>
+    </w:lvl>
+  </w:abstractNum>
+  <w:abstractNum w:abstractNumId="5" w15:restartNumberingAfterBreak="0">
     <w:nsid w:val="19B976B4"/>
     <w:multiLevelType w:val="multilevel"/>
     <w:tmpl w:val="6E52A762"/>
@@ -7715,7 +9049,7 @@
       </w:rPr>
     </w:lvl>
   </w:abstractNum>
-  <w:abstractNum w:abstractNumId="5" w15:restartNumberingAfterBreak="0">
+  <w:abstractNum w:abstractNumId="6" w15:restartNumberingAfterBreak="0">
     <w:nsid w:val="1BE859D8"/>
     <w:multiLevelType w:val="multilevel"/>
     <w:tmpl w:val="F9DAC2B2"/>
@@ -7864,7 +9198,7 @@
       </w:rPr>
     </w:lvl>
   </w:abstractNum>
-  <w:abstractNum w:abstractNumId="6" w15:restartNumberingAfterBreak="0">
+  <w:abstractNum w:abstractNumId="7" w15:restartNumberingAfterBreak="0">
     <w:nsid w:val="1CA10960"/>
     <w:multiLevelType w:val="multilevel"/>
     <w:tmpl w:val="9394F97A"/>
@@ -8013,7 +9347,7 @@
       </w:rPr>
     </w:lvl>
   </w:abstractNum>
-  <w:abstractNum w:abstractNumId="7" w15:restartNumberingAfterBreak="0">
+  <w:abstractNum w:abstractNumId="8" w15:restartNumberingAfterBreak="0">
     <w:nsid w:val="2804498D"/>
     <w:multiLevelType w:val="multilevel"/>
     <w:tmpl w:val="F508E3D4"/>
@@ -8134,7 +9468,7 @@
       </w:pPr>
     </w:lvl>
   </w:abstractNum>
-  <w:abstractNum w:abstractNumId="8" w15:restartNumberingAfterBreak="0">
+  <w:abstractNum w:abstractNumId="9" w15:restartNumberingAfterBreak="0">
     <w:nsid w:val="2924720D"/>
     <w:multiLevelType w:val="multilevel"/>
     <w:tmpl w:val="64C8C680"/>
@@ -8251,7 +9585,7 @@
       </w:pPr>
     </w:lvl>
   </w:abstractNum>
-  <w:abstractNum w:abstractNumId="9" w15:restartNumberingAfterBreak="0">
+  <w:abstractNum w:abstractNumId="10" w15:restartNumberingAfterBreak="0">
     <w:nsid w:val="29BE0B85"/>
     <w:multiLevelType w:val="multilevel"/>
     <w:tmpl w:val="204435E0"/>
@@ -8400,7 +9734,7 @@
       </w:rPr>
     </w:lvl>
   </w:abstractNum>
-  <w:abstractNum w:abstractNumId="10" w15:restartNumberingAfterBreak="0">
+  <w:abstractNum w:abstractNumId="11" w15:restartNumberingAfterBreak="0">
     <w:nsid w:val="2A2B628D"/>
     <w:multiLevelType w:val="multilevel"/>
     <w:tmpl w:val="02060DE2"/>
@@ -8549,7 +9883,7 @@
       </w:rPr>
     </w:lvl>
   </w:abstractNum>
-  <w:abstractNum w:abstractNumId="11" w15:restartNumberingAfterBreak="0">
+  <w:abstractNum w:abstractNumId="12" w15:restartNumberingAfterBreak="0">
     <w:nsid w:val="2EAB0F35"/>
     <w:multiLevelType w:val="multilevel"/>
     <w:tmpl w:val="484C06EC"/>
@@ -8662,7 +9996,7 @@
       </w:pPr>
     </w:lvl>
   </w:abstractNum>
-  <w:abstractNum w:abstractNumId="12" w15:restartNumberingAfterBreak="0">
+  <w:abstractNum w:abstractNumId="13" w15:restartNumberingAfterBreak="0">
     <w:nsid w:val="2EAE1111"/>
     <w:multiLevelType w:val="multilevel"/>
     <w:tmpl w:val="D3CCF344"/>
@@ -8811,7 +10145,7 @@
       </w:rPr>
     </w:lvl>
   </w:abstractNum>
-  <w:abstractNum w:abstractNumId="13" w15:restartNumberingAfterBreak="0">
+  <w:abstractNum w:abstractNumId="14" w15:restartNumberingAfterBreak="0">
     <w:nsid w:val="32FD465A"/>
     <w:multiLevelType w:val="multilevel"/>
     <w:tmpl w:val="38D24FE6"/>
@@ -8960,7 +10294,7 @@
       </w:rPr>
     </w:lvl>
   </w:abstractNum>
-  <w:abstractNum w:abstractNumId="14" w15:restartNumberingAfterBreak="0">
+  <w:abstractNum w:abstractNumId="15" w15:restartNumberingAfterBreak="0">
     <w:nsid w:val="33D23B02"/>
     <w:multiLevelType w:val="multilevel"/>
     <w:tmpl w:val="0DD2A68E"/>
@@ -9077,7 +10411,7 @@
       </w:pPr>
     </w:lvl>
   </w:abstractNum>
-  <w:abstractNum w:abstractNumId="15" w15:restartNumberingAfterBreak="0">
+  <w:abstractNum w:abstractNumId="16" w15:restartNumberingAfterBreak="0">
     <w:nsid w:val="37770F6A"/>
     <w:multiLevelType w:val="multilevel"/>
     <w:tmpl w:val="03F40D80"/>
@@ -9194,7 +10528,7 @@
       </w:pPr>
     </w:lvl>
   </w:abstractNum>
-  <w:abstractNum w:abstractNumId="16" w15:restartNumberingAfterBreak="0">
+  <w:abstractNum w:abstractNumId="17" w15:restartNumberingAfterBreak="0">
     <w:nsid w:val="38A97282"/>
     <w:multiLevelType w:val="multilevel"/>
     <w:tmpl w:val="6EAC2EB2"/>
@@ -9343,7 +10677,156 @@
       </w:rPr>
     </w:lvl>
   </w:abstractNum>
-  <w:abstractNum w:abstractNumId="17" w15:restartNumberingAfterBreak="0">
+  <w:abstractNum w:abstractNumId="18" w15:restartNumberingAfterBreak="0">
+    <w:nsid w:val="38B12A9A"/>
+    <w:multiLevelType w:val="multilevel"/>
+    <w:tmpl w:val="2D06C7D2"/>
+    <w:lvl w:ilvl="0">
+      <w:start w:val="1"/>
+      <w:numFmt w:val="bullet"/>
+      <w:lvlText w:val=""/>
+      <w:lvlJc w:val="left"/>
+      <w:pPr>
+        <w:tabs>
+          <w:tab w:val="num" w:pos="720"/>
+        </w:tabs>
+        <w:ind w:left="720" w:hanging="360"/>
+      </w:pPr>
+      <w:rPr>
+        <w:rFonts w:ascii="Symbol" w:hAnsi="Symbol" w:hint="default"/>
+        <w:sz w:val="20"/>
+      </w:rPr>
+    </w:lvl>
+    <w:lvl w:ilvl="1" w:tentative="1">
+      <w:start w:val="1"/>
+      <w:numFmt w:val="bullet"/>
+      <w:lvlText w:val="o"/>
+      <w:lvlJc w:val="left"/>
+      <w:pPr>
+        <w:tabs>
+          <w:tab w:val="num" w:pos="1440"/>
+        </w:tabs>
+        <w:ind w:left="1440" w:hanging="360"/>
+      </w:pPr>
+      <w:rPr>
+        <w:rFonts w:ascii="Courier New" w:hAnsi="Courier New" w:hint="default"/>
+        <w:sz w:val="20"/>
+      </w:rPr>
+    </w:lvl>
+    <w:lvl w:ilvl="2" w:tentative="1">
+      <w:start w:val="1"/>
+      <w:numFmt w:val="bullet"/>
+      <w:lvlText w:val=""/>
+      <w:lvlJc w:val="left"/>
+      <w:pPr>
+        <w:tabs>
+          <w:tab w:val="num" w:pos="2160"/>
+        </w:tabs>
+        <w:ind w:left="2160" w:hanging="360"/>
+      </w:pPr>
+      <w:rPr>
+        <w:rFonts w:ascii="Wingdings" w:hAnsi="Wingdings" w:hint="default"/>
+        <w:sz w:val="20"/>
+      </w:rPr>
+    </w:lvl>
+    <w:lvl w:ilvl="3" w:tentative="1">
+      <w:start w:val="1"/>
+      <w:numFmt w:val="bullet"/>
+      <w:lvlText w:val=""/>
+      <w:lvlJc w:val="left"/>
+      <w:pPr>
+        <w:tabs>
+          <w:tab w:val="num" w:pos="2880"/>
+        </w:tabs>
+        <w:ind w:left="2880" w:hanging="360"/>
+      </w:pPr>
+      <w:rPr>
+        <w:rFonts w:ascii="Wingdings" w:hAnsi="Wingdings" w:hint="default"/>
+        <w:sz w:val="20"/>
+      </w:rPr>
+    </w:lvl>
+    <w:lvl w:ilvl="4" w:tentative="1">
+      <w:start w:val="1"/>
+      <w:numFmt w:val="bullet"/>
+      <w:lvlText w:val=""/>
+      <w:lvlJc w:val="left"/>
+      <w:pPr>
+        <w:tabs>
+          <w:tab w:val="num" w:pos="3600"/>
+        </w:tabs>
+        <w:ind w:left="3600" w:hanging="360"/>
+      </w:pPr>
+      <w:rPr>
+        <w:rFonts w:ascii="Wingdings" w:hAnsi="Wingdings" w:hint="default"/>
+        <w:sz w:val="20"/>
+      </w:rPr>
+    </w:lvl>
+    <w:lvl w:ilvl="5" w:tentative="1">
+      <w:start w:val="1"/>
+      <w:numFmt w:val="bullet"/>
+      <w:lvlText w:val=""/>
+      <w:lvlJc w:val="left"/>
+      <w:pPr>
+        <w:tabs>
+          <w:tab w:val="num" w:pos="4320"/>
+        </w:tabs>
+        <w:ind w:left="4320" w:hanging="360"/>
+      </w:pPr>
+      <w:rPr>
+        <w:rFonts w:ascii="Wingdings" w:hAnsi="Wingdings" w:hint="default"/>
+        <w:sz w:val="20"/>
+      </w:rPr>
+    </w:lvl>
+    <w:lvl w:ilvl="6" w:tentative="1">
+      <w:start w:val="1"/>
+      <w:numFmt w:val="bullet"/>
+      <w:lvlText w:val=""/>
+      <w:lvlJc w:val="left"/>
+      <w:pPr>
+        <w:tabs>
+          <w:tab w:val="num" w:pos="5040"/>
+        </w:tabs>
+        <w:ind w:left="5040" w:hanging="360"/>
+      </w:pPr>
+      <w:rPr>
+        <w:rFonts w:ascii="Wingdings" w:hAnsi="Wingdings" w:hint="default"/>
+        <w:sz w:val="20"/>
+      </w:rPr>
+    </w:lvl>
+    <w:lvl w:ilvl="7" w:tentative="1">
+      <w:start w:val="1"/>
+      <w:numFmt w:val="bullet"/>
+      <w:lvlText w:val=""/>
+      <w:lvlJc w:val="left"/>
+      <w:pPr>
+        <w:tabs>
+          <w:tab w:val="num" w:pos="5760"/>
+        </w:tabs>
+        <w:ind w:left="5760" w:hanging="360"/>
+      </w:pPr>
+      <w:rPr>
+        <w:rFonts w:ascii="Wingdings" w:hAnsi="Wingdings" w:hint="default"/>
+        <w:sz w:val="20"/>
+      </w:rPr>
+    </w:lvl>
+    <w:lvl w:ilvl="8" w:tentative="1">
+      <w:start w:val="1"/>
+      <w:numFmt w:val="bullet"/>
+      <w:lvlText w:val=""/>
+      <w:lvlJc w:val="left"/>
+      <w:pPr>
+        <w:tabs>
+          <w:tab w:val="num" w:pos="6480"/>
+        </w:tabs>
+        <w:ind w:left="6480" w:hanging="360"/>
+      </w:pPr>
+      <w:rPr>
+        <w:rFonts w:ascii="Wingdings" w:hAnsi="Wingdings" w:hint="default"/>
+        <w:sz w:val="20"/>
+      </w:rPr>
+    </w:lvl>
+  </w:abstractNum>
+  <w:abstractNum w:abstractNumId="19" w15:restartNumberingAfterBreak="0">
     <w:nsid w:val="3C387EAF"/>
     <w:multiLevelType w:val="multilevel"/>
     <w:tmpl w:val="B94AE78E"/>
@@ -9492,7 +10975,7 @@
       </w:rPr>
     </w:lvl>
   </w:abstractNum>
-  <w:abstractNum w:abstractNumId="18" w15:restartNumberingAfterBreak="0">
+  <w:abstractNum w:abstractNumId="20" w15:restartNumberingAfterBreak="0">
     <w:nsid w:val="3F0C6547"/>
     <w:multiLevelType w:val="multilevel"/>
     <w:tmpl w:val="30B2843A"/>
@@ -9609,7 +11092,7 @@
       </w:pPr>
     </w:lvl>
   </w:abstractNum>
-  <w:abstractNum w:abstractNumId="19" w15:restartNumberingAfterBreak="0">
+  <w:abstractNum w:abstractNumId="21" w15:restartNumberingAfterBreak="0">
     <w:nsid w:val="3FAC7D1A"/>
     <w:multiLevelType w:val="multilevel"/>
     <w:tmpl w:val="57BA0FB4"/>
@@ -9726,7 +11209,156 @@
       </w:pPr>
     </w:lvl>
   </w:abstractNum>
-  <w:abstractNum w:abstractNumId="20" w15:restartNumberingAfterBreak="0">
+  <w:abstractNum w:abstractNumId="22" w15:restartNumberingAfterBreak="0">
+    <w:nsid w:val="45C37EDC"/>
+    <w:multiLevelType w:val="multilevel"/>
+    <w:tmpl w:val="02921E6A"/>
+    <w:lvl w:ilvl="0">
+      <w:start w:val="1"/>
+      <w:numFmt w:val="bullet"/>
+      <w:lvlText w:val=""/>
+      <w:lvlJc w:val="left"/>
+      <w:pPr>
+        <w:tabs>
+          <w:tab w:val="num" w:pos="720"/>
+        </w:tabs>
+        <w:ind w:left="720" w:hanging="360"/>
+      </w:pPr>
+      <w:rPr>
+        <w:rFonts w:ascii="Symbol" w:hAnsi="Symbol" w:hint="default"/>
+        <w:sz w:val="20"/>
+      </w:rPr>
+    </w:lvl>
+    <w:lvl w:ilvl="1" w:tentative="1">
+      <w:start w:val="1"/>
+      <w:numFmt w:val="bullet"/>
+      <w:lvlText w:val="o"/>
+      <w:lvlJc w:val="left"/>
+      <w:pPr>
+        <w:tabs>
+          <w:tab w:val="num" w:pos="1440"/>
+        </w:tabs>
+        <w:ind w:left="1440" w:hanging="360"/>
+      </w:pPr>
+      <w:rPr>
+        <w:rFonts w:ascii="Courier New" w:hAnsi="Courier New" w:hint="default"/>
+        <w:sz w:val="20"/>
+      </w:rPr>
+    </w:lvl>
+    <w:lvl w:ilvl="2" w:tentative="1">
+      <w:start w:val="1"/>
+      <w:numFmt w:val="bullet"/>
+      <w:lvlText w:val=""/>
+      <w:lvlJc w:val="left"/>
+      <w:pPr>
+        <w:tabs>
+          <w:tab w:val="num" w:pos="2160"/>
+        </w:tabs>
+        <w:ind w:left="2160" w:hanging="360"/>
+      </w:pPr>
+      <w:rPr>
+        <w:rFonts w:ascii="Wingdings" w:hAnsi="Wingdings" w:hint="default"/>
+        <w:sz w:val="20"/>
+      </w:rPr>
+    </w:lvl>
+    <w:lvl w:ilvl="3" w:tentative="1">
+      <w:start w:val="1"/>
+      <w:numFmt w:val="bullet"/>
+      <w:lvlText w:val=""/>
+      <w:lvlJc w:val="left"/>
+      <w:pPr>
+        <w:tabs>
+          <w:tab w:val="num" w:pos="2880"/>
+        </w:tabs>
+        <w:ind w:left="2880" w:hanging="360"/>
+      </w:pPr>
+      <w:rPr>
+        <w:rFonts w:ascii="Wingdings" w:hAnsi="Wingdings" w:hint="default"/>
+        <w:sz w:val="20"/>
+      </w:rPr>
+    </w:lvl>
+    <w:lvl w:ilvl="4" w:tentative="1">
+      <w:start w:val="1"/>
+      <w:numFmt w:val="bullet"/>
+      <w:lvlText w:val=""/>
+      <w:lvlJc w:val="left"/>
+      <w:pPr>
+        <w:tabs>
+          <w:tab w:val="num" w:pos="3600"/>
+        </w:tabs>
+        <w:ind w:left="3600" w:hanging="360"/>
+      </w:pPr>
+      <w:rPr>
+        <w:rFonts w:ascii="Wingdings" w:hAnsi="Wingdings" w:hint="default"/>
+        <w:sz w:val="20"/>
+      </w:rPr>
+    </w:lvl>
+    <w:lvl w:ilvl="5" w:tentative="1">
+      <w:start w:val="1"/>
+      <w:numFmt w:val="bullet"/>
+      <w:lvlText w:val=""/>
+      <w:lvlJc w:val="left"/>
+      <w:pPr>
+        <w:tabs>
+          <w:tab w:val="num" w:pos="4320"/>
+        </w:tabs>
+        <w:ind w:left="4320" w:hanging="360"/>
+      </w:pPr>
+      <w:rPr>
+        <w:rFonts w:ascii="Wingdings" w:hAnsi="Wingdings" w:hint="default"/>
+        <w:sz w:val="20"/>
+      </w:rPr>
+    </w:lvl>
+    <w:lvl w:ilvl="6" w:tentative="1">
+      <w:start w:val="1"/>
+      <w:numFmt w:val="bullet"/>
+      <w:lvlText w:val=""/>
+      <w:lvlJc w:val="left"/>
+      <w:pPr>
+        <w:tabs>
+          <w:tab w:val="num" w:pos="5040"/>
+        </w:tabs>
+        <w:ind w:left="5040" w:hanging="360"/>
+      </w:pPr>
+      <w:rPr>
+        <w:rFonts w:ascii="Wingdings" w:hAnsi="Wingdings" w:hint="default"/>
+        <w:sz w:val="20"/>
+      </w:rPr>
+    </w:lvl>
+    <w:lvl w:ilvl="7" w:tentative="1">
+      <w:start w:val="1"/>
+      <w:numFmt w:val="bullet"/>
+      <w:lvlText w:val=""/>
+      <w:lvlJc w:val="left"/>
+      <w:pPr>
+        <w:tabs>
+          <w:tab w:val="num" w:pos="5760"/>
+        </w:tabs>
+        <w:ind w:left="5760" w:hanging="360"/>
+      </w:pPr>
+      <w:rPr>
+        <w:rFonts w:ascii="Wingdings" w:hAnsi="Wingdings" w:hint="default"/>
+        <w:sz w:val="20"/>
+      </w:rPr>
+    </w:lvl>
+    <w:lvl w:ilvl="8" w:tentative="1">
+      <w:start w:val="1"/>
+      <w:numFmt w:val="bullet"/>
+      <w:lvlText w:val=""/>
+      <w:lvlJc w:val="left"/>
+      <w:pPr>
+        <w:tabs>
+          <w:tab w:val="num" w:pos="6480"/>
+        </w:tabs>
+        <w:ind w:left="6480" w:hanging="360"/>
+      </w:pPr>
+      <w:rPr>
+        <w:rFonts w:ascii="Wingdings" w:hAnsi="Wingdings" w:hint="default"/>
+        <w:sz w:val="20"/>
+      </w:rPr>
+    </w:lvl>
+  </w:abstractNum>
+  <w:abstractNum w:abstractNumId="23" w15:restartNumberingAfterBreak="0">
     <w:nsid w:val="48EC4783"/>
     <w:multiLevelType w:val="multilevel"/>
     <w:tmpl w:val="839ED8B8"/>
@@ -9843,7 +11475,7 @@
       </w:pPr>
     </w:lvl>
   </w:abstractNum>
-  <w:abstractNum w:abstractNumId="21" w15:restartNumberingAfterBreak="0">
+  <w:abstractNum w:abstractNumId="24" w15:restartNumberingAfterBreak="0">
     <w:nsid w:val="4C262202"/>
     <w:multiLevelType w:val="multilevel"/>
     <w:tmpl w:val="AE14CAC6"/>
@@ -9992,7 +11624,7 @@
       </w:rPr>
     </w:lvl>
   </w:abstractNum>
-  <w:abstractNum w:abstractNumId="22" w15:restartNumberingAfterBreak="0">
+  <w:abstractNum w:abstractNumId="25" w15:restartNumberingAfterBreak="0">
     <w:nsid w:val="4C5F1B32"/>
     <w:multiLevelType w:val="multilevel"/>
     <w:tmpl w:val="FF18DBB0"/>
@@ -10109,7 +11741,7 @@
       </w:pPr>
     </w:lvl>
   </w:abstractNum>
-  <w:abstractNum w:abstractNumId="23" w15:restartNumberingAfterBreak="0">
+  <w:abstractNum w:abstractNumId="26" w15:restartNumberingAfterBreak="0">
     <w:nsid w:val="4CBE4F1D"/>
     <w:multiLevelType w:val="multilevel"/>
     <w:tmpl w:val="B6CEA44C"/>
@@ -10258,7 +11890,7 @@
       </w:rPr>
     </w:lvl>
   </w:abstractNum>
-  <w:abstractNum w:abstractNumId="24" w15:restartNumberingAfterBreak="0">
+  <w:abstractNum w:abstractNumId="27" w15:restartNumberingAfterBreak="0">
     <w:nsid w:val="502861E4"/>
     <w:multiLevelType w:val="multilevel"/>
     <w:tmpl w:val="44FCDB24"/>
@@ -10407,7 +12039,156 @@
       </w:rPr>
     </w:lvl>
   </w:abstractNum>
-  <w:abstractNum w:abstractNumId="25" w15:restartNumberingAfterBreak="0">
+  <w:abstractNum w:abstractNumId="28" w15:restartNumberingAfterBreak="0">
+    <w:nsid w:val="507D23F8"/>
+    <w:multiLevelType w:val="multilevel"/>
+    <w:tmpl w:val="1AD6EEA6"/>
+    <w:lvl w:ilvl="0">
+      <w:start w:val="1"/>
+      <w:numFmt w:val="bullet"/>
+      <w:lvlText w:val=""/>
+      <w:lvlJc w:val="left"/>
+      <w:pPr>
+        <w:tabs>
+          <w:tab w:val="num" w:pos="720"/>
+        </w:tabs>
+        <w:ind w:left="720" w:hanging="360"/>
+      </w:pPr>
+      <w:rPr>
+        <w:rFonts w:ascii="Symbol" w:hAnsi="Symbol" w:hint="default"/>
+        <w:sz w:val="20"/>
+      </w:rPr>
+    </w:lvl>
+    <w:lvl w:ilvl="1">
+      <w:start w:val="1"/>
+      <w:numFmt w:val="bullet"/>
+      <w:lvlText w:val="o"/>
+      <w:lvlJc w:val="left"/>
+      <w:pPr>
+        <w:tabs>
+          <w:tab w:val="num" w:pos="1440"/>
+        </w:tabs>
+        <w:ind w:left="1440" w:hanging="360"/>
+      </w:pPr>
+      <w:rPr>
+        <w:rFonts w:ascii="Courier New" w:hAnsi="Courier New" w:hint="default"/>
+        <w:sz w:val="20"/>
+      </w:rPr>
+    </w:lvl>
+    <w:lvl w:ilvl="2" w:tentative="1">
+      <w:start w:val="1"/>
+      <w:numFmt w:val="bullet"/>
+      <w:lvlText w:val=""/>
+      <w:lvlJc w:val="left"/>
+      <w:pPr>
+        <w:tabs>
+          <w:tab w:val="num" w:pos="2160"/>
+        </w:tabs>
+        <w:ind w:left="2160" w:hanging="360"/>
+      </w:pPr>
+      <w:rPr>
+        <w:rFonts w:ascii="Wingdings" w:hAnsi="Wingdings" w:hint="default"/>
+        <w:sz w:val="20"/>
+      </w:rPr>
+    </w:lvl>
+    <w:lvl w:ilvl="3" w:tentative="1">
+      <w:start w:val="1"/>
+      <w:numFmt w:val="bullet"/>
+      <w:lvlText w:val=""/>
+      <w:lvlJc w:val="left"/>
+      <w:pPr>
+        <w:tabs>
+          <w:tab w:val="num" w:pos="2880"/>
+        </w:tabs>
+        <w:ind w:left="2880" w:hanging="360"/>
+      </w:pPr>
+      <w:rPr>
+        <w:rFonts w:ascii="Wingdings" w:hAnsi="Wingdings" w:hint="default"/>
+        <w:sz w:val="20"/>
+      </w:rPr>
+    </w:lvl>
+    <w:lvl w:ilvl="4" w:tentative="1">
+      <w:start w:val="1"/>
+      <w:numFmt w:val="bullet"/>
+      <w:lvlText w:val=""/>
+      <w:lvlJc w:val="left"/>
+      <w:pPr>
+        <w:tabs>
+          <w:tab w:val="num" w:pos="3600"/>
+        </w:tabs>
+        <w:ind w:left="3600" w:hanging="360"/>
+      </w:pPr>
+      <w:rPr>
+        <w:rFonts w:ascii="Wingdings" w:hAnsi="Wingdings" w:hint="default"/>
+        <w:sz w:val="20"/>
+      </w:rPr>
+    </w:lvl>
+    <w:lvl w:ilvl="5" w:tentative="1">
+      <w:start w:val="1"/>
+      <w:numFmt w:val="bullet"/>
+      <w:lvlText w:val=""/>
+      <w:lvlJc w:val="left"/>
+      <w:pPr>
+        <w:tabs>
+          <w:tab w:val="num" w:pos="4320"/>
+        </w:tabs>
+        <w:ind w:left="4320" w:hanging="360"/>
+      </w:pPr>
+      <w:rPr>
+        <w:rFonts w:ascii="Wingdings" w:hAnsi="Wingdings" w:hint="default"/>
+        <w:sz w:val="20"/>
+      </w:rPr>
+    </w:lvl>
+    <w:lvl w:ilvl="6" w:tentative="1">
+      <w:start w:val="1"/>
+      <w:numFmt w:val="bullet"/>
+      <w:lvlText w:val=""/>
+      <w:lvlJc w:val="left"/>
+      <w:pPr>
+        <w:tabs>
+          <w:tab w:val="num" w:pos="5040"/>
+        </w:tabs>
+        <w:ind w:left="5040" w:hanging="360"/>
+      </w:pPr>
+      <w:rPr>
+        <w:rFonts w:ascii="Wingdings" w:hAnsi="Wingdings" w:hint="default"/>
+        <w:sz w:val="20"/>
+      </w:rPr>
+    </w:lvl>
+    <w:lvl w:ilvl="7" w:tentative="1">
+      <w:start w:val="1"/>
+      <w:numFmt w:val="bullet"/>
+      <w:lvlText w:val=""/>
+      <w:lvlJc w:val="left"/>
+      <w:pPr>
+        <w:tabs>
+          <w:tab w:val="num" w:pos="5760"/>
+        </w:tabs>
+        <w:ind w:left="5760" w:hanging="360"/>
+      </w:pPr>
+      <w:rPr>
+        <w:rFonts w:ascii="Wingdings" w:hAnsi="Wingdings" w:hint="default"/>
+        <w:sz w:val="20"/>
+      </w:rPr>
+    </w:lvl>
+    <w:lvl w:ilvl="8" w:tentative="1">
+      <w:start w:val="1"/>
+      <w:numFmt w:val="bullet"/>
+      <w:lvlText w:val=""/>
+      <w:lvlJc w:val="left"/>
+      <w:pPr>
+        <w:tabs>
+          <w:tab w:val="num" w:pos="6480"/>
+        </w:tabs>
+        <w:ind w:left="6480" w:hanging="360"/>
+      </w:pPr>
+      <w:rPr>
+        <w:rFonts w:ascii="Wingdings" w:hAnsi="Wingdings" w:hint="default"/>
+        <w:sz w:val="20"/>
+      </w:rPr>
+    </w:lvl>
+  </w:abstractNum>
+  <w:abstractNum w:abstractNumId="29" w15:restartNumberingAfterBreak="0">
     <w:nsid w:val="53B76530"/>
     <w:multiLevelType w:val="multilevel"/>
     <w:tmpl w:val="4FF605BA"/>
@@ -10524,7 +12305,7 @@
       </w:pPr>
     </w:lvl>
   </w:abstractNum>
-  <w:abstractNum w:abstractNumId="26" w15:restartNumberingAfterBreak="0">
+  <w:abstractNum w:abstractNumId="30" w15:restartNumberingAfterBreak="0">
     <w:nsid w:val="5C974F70"/>
     <w:multiLevelType w:val="multilevel"/>
     <w:tmpl w:val="932ECEB4"/>
@@ -10673,7 +12454,7 @@
       </w:rPr>
     </w:lvl>
   </w:abstractNum>
-  <w:abstractNum w:abstractNumId="27" w15:restartNumberingAfterBreak="0">
+  <w:abstractNum w:abstractNumId="31" w15:restartNumberingAfterBreak="0">
     <w:nsid w:val="5CF32354"/>
     <w:multiLevelType w:val="multilevel"/>
     <w:tmpl w:val="F1CEEFA0"/>
@@ -10822,7 +12603,7 @@
       </w:rPr>
     </w:lvl>
   </w:abstractNum>
-  <w:abstractNum w:abstractNumId="28" w15:restartNumberingAfterBreak="0">
+  <w:abstractNum w:abstractNumId="32" w15:restartNumberingAfterBreak="0">
     <w:nsid w:val="61CE74E1"/>
     <w:multiLevelType w:val="multilevel"/>
     <w:tmpl w:val="5B6A555C"/>
@@ -10939,7 +12720,7 @@
       </w:pPr>
     </w:lvl>
   </w:abstractNum>
-  <w:abstractNum w:abstractNumId="29" w15:restartNumberingAfterBreak="0">
+  <w:abstractNum w:abstractNumId="33" w15:restartNumberingAfterBreak="0">
     <w:nsid w:val="6324352B"/>
     <w:multiLevelType w:val="multilevel"/>
     <w:tmpl w:val="D1903E78"/>
@@ -11088,7 +12869,7 @@
       </w:rPr>
     </w:lvl>
   </w:abstractNum>
-  <w:abstractNum w:abstractNumId="30" w15:restartNumberingAfterBreak="0">
+  <w:abstractNum w:abstractNumId="34" w15:restartNumberingAfterBreak="0">
     <w:nsid w:val="64044AFA"/>
     <w:multiLevelType w:val="multilevel"/>
     <w:tmpl w:val="4D423248"/>
@@ -11237,7 +13018,7 @@
       </w:rPr>
     </w:lvl>
   </w:abstractNum>
-  <w:abstractNum w:abstractNumId="31" w15:restartNumberingAfterBreak="0">
+  <w:abstractNum w:abstractNumId="35" w15:restartNumberingAfterBreak="0">
     <w:nsid w:val="680A0A0E"/>
     <w:multiLevelType w:val="multilevel"/>
     <w:tmpl w:val="CCEAA226"/>
@@ -11354,7 +13135,7 @@
       </w:pPr>
     </w:lvl>
   </w:abstractNum>
-  <w:abstractNum w:abstractNumId="32" w15:restartNumberingAfterBreak="0">
+  <w:abstractNum w:abstractNumId="36" w15:restartNumberingAfterBreak="0">
     <w:nsid w:val="68DC13D5"/>
     <w:multiLevelType w:val="multilevel"/>
     <w:tmpl w:val="F8940A48"/>
@@ -11467,7 +13248,7 @@
       </w:pPr>
     </w:lvl>
   </w:abstractNum>
-  <w:abstractNum w:abstractNumId="33" w15:restartNumberingAfterBreak="0">
+  <w:abstractNum w:abstractNumId="37" w15:restartNumberingAfterBreak="0">
     <w:nsid w:val="690521A4"/>
     <w:multiLevelType w:val="multilevel"/>
     <w:tmpl w:val="8B0022DC"/>
@@ -11616,7 +13397,156 @@
       </w:rPr>
     </w:lvl>
   </w:abstractNum>
-  <w:abstractNum w:abstractNumId="34" w15:restartNumberingAfterBreak="0">
+  <w:abstractNum w:abstractNumId="38" w15:restartNumberingAfterBreak="0">
+    <w:nsid w:val="6BF55342"/>
+    <w:multiLevelType w:val="multilevel"/>
+    <w:tmpl w:val="8F42795E"/>
+    <w:lvl w:ilvl="0">
+      <w:start w:val="1"/>
+      <w:numFmt w:val="bullet"/>
+      <w:lvlText w:val=""/>
+      <w:lvlJc w:val="left"/>
+      <w:pPr>
+        <w:tabs>
+          <w:tab w:val="num" w:pos="720"/>
+        </w:tabs>
+        <w:ind w:left="720" w:hanging="360"/>
+      </w:pPr>
+      <w:rPr>
+        <w:rFonts w:ascii="Symbol" w:hAnsi="Symbol" w:hint="default"/>
+        <w:sz w:val="20"/>
+      </w:rPr>
+    </w:lvl>
+    <w:lvl w:ilvl="1" w:tentative="1">
+      <w:start w:val="1"/>
+      <w:numFmt w:val="bullet"/>
+      <w:lvlText w:val="o"/>
+      <w:lvlJc w:val="left"/>
+      <w:pPr>
+        <w:tabs>
+          <w:tab w:val="num" w:pos="1440"/>
+        </w:tabs>
+        <w:ind w:left="1440" w:hanging="360"/>
+      </w:pPr>
+      <w:rPr>
+        <w:rFonts w:ascii="Courier New" w:hAnsi="Courier New" w:hint="default"/>
+        <w:sz w:val="20"/>
+      </w:rPr>
+    </w:lvl>
+    <w:lvl w:ilvl="2" w:tentative="1">
+      <w:start w:val="1"/>
+      <w:numFmt w:val="bullet"/>
+      <w:lvlText w:val=""/>
+      <w:lvlJc w:val="left"/>
+      <w:pPr>
+        <w:tabs>
+          <w:tab w:val="num" w:pos="2160"/>
+        </w:tabs>
+        <w:ind w:left="2160" w:hanging="360"/>
+      </w:pPr>
+      <w:rPr>
+        <w:rFonts w:ascii="Wingdings" w:hAnsi="Wingdings" w:hint="default"/>
+        <w:sz w:val="20"/>
+      </w:rPr>
+    </w:lvl>
+    <w:lvl w:ilvl="3" w:tentative="1">
+      <w:start w:val="1"/>
+      <w:numFmt w:val="bullet"/>
+      <w:lvlText w:val=""/>
+      <w:lvlJc w:val="left"/>
+      <w:pPr>
+        <w:tabs>
+          <w:tab w:val="num" w:pos="2880"/>
+        </w:tabs>
+        <w:ind w:left="2880" w:hanging="360"/>
+      </w:pPr>
+      <w:rPr>
+        <w:rFonts w:ascii="Wingdings" w:hAnsi="Wingdings" w:hint="default"/>
+        <w:sz w:val="20"/>
+      </w:rPr>
+    </w:lvl>
+    <w:lvl w:ilvl="4" w:tentative="1">
+      <w:start w:val="1"/>
+      <w:numFmt w:val="bullet"/>
+      <w:lvlText w:val=""/>
+      <w:lvlJc w:val="left"/>
+      <w:pPr>
+        <w:tabs>
+          <w:tab w:val="num" w:pos="3600"/>
+        </w:tabs>
+        <w:ind w:left="3600" w:hanging="360"/>
+      </w:pPr>
+      <w:rPr>
+        <w:rFonts w:ascii="Wingdings" w:hAnsi="Wingdings" w:hint="default"/>
+        <w:sz w:val="20"/>
+      </w:rPr>
+    </w:lvl>
+    <w:lvl w:ilvl="5" w:tentative="1">
+      <w:start w:val="1"/>
+      <w:numFmt w:val="bullet"/>
+      <w:lvlText w:val=""/>
+      <w:lvlJc w:val="left"/>
+      <w:pPr>
+        <w:tabs>
+          <w:tab w:val="num" w:pos="4320"/>
+        </w:tabs>
+        <w:ind w:left="4320" w:hanging="360"/>
+      </w:pPr>
+      <w:rPr>
+        <w:rFonts w:ascii="Wingdings" w:hAnsi="Wingdings" w:hint="default"/>
+        <w:sz w:val="20"/>
+      </w:rPr>
+    </w:lvl>
+    <w:lvl w:ilvl="6" w:tentative="1">
+      <w:start w:val="1"/>
+      <w:numFmt w:val="bullet"/>
+      <w:lvlText w:val=""/>
+      <w:lvlJc w:val="left"/>
+      <w:pPr>
+        <w:tabs>
+          <w:tab w:val="num" w:pos="5040"/>
+        </w:tabs>
+        <w:ind w:left="5040" w:hanging="360"/>
+      </w:pPr>
+      <w:rPr>
+        <w:rFonts w:ascii="Wingdings" w:hAnsi="Wingdings" w:hint="default"/>
+        <w:sz w:val="20"/>
+      </w:rPr>
+    </w:lvl>
+    <w:lvl w:ilvl="7" w:tentative="1">
+      <w:start w:val="1"/>
+      <w:numFmt w:val="bullet"/>
+      <w:lvlText w:val=""/>
+      <w:lvlJc w:val="left"/>
+      <w:pPr>
+        <w:tabs>
+          <w:tab w:val="num" w:pos="5760"/>
+        </w:tabs>
+        <w:ind w:left="5760" w:hanging="360"/>
+      </w:pPr>
+      <w:rPr>
+        <w:rFonts w:ascii="Wingdings" w:hAnsi="Wingdings" w:hint="default"/>
+        <w:sz w:val="20"/>
+      </w:rPr>
+    </w:lvl>
+    <w:lvl w:ilvl="8" w:tentative="1">
+      <w:start w:val="1"/>
+      <w:numFmt w:val="bullet"/>
+      <w:lvlText w:val=""/>
+      <w:lvlJc w:val="left"/>
+      <w:pPr>
+        <w:tabs>
+          <w:tab w:val="num" w:pos="6480"/>
+        </w:tabs>
+        <w:ind w:left="6480" w:hanging="360"/>
+      </w:pPr>
+      <w:rPr>
+        <w:rFonts w:ascii="Wingdings" w:hAnsi="Wingdings" w:hint="default"/>
+        <w:sz w:val="20"/>
+      </w:rPr>
+    </w:lvl>
+  </w:abstractNum>
+  <w:abstractNum w:abstractNumId="39" w15:restartNumberingAfterBreak="0">
     <w:nsid w:val="6C182B52"/>
     <w:multiLevelType w:val="multilevel"/>
     <w:tmpl w:val="4172FCD8"/>
@@ -11729,7 +13659,7 @@
       </w:pPr>
     </w:lvl>
   </w:abstractNum>
-  <w:abstractNum w:abstractNumId="35" w15:restartNumberingAfterBreak="0">
+  <w:abstractNum w:abstractNumId="40" w15:restartNumberingAfterBreak="0">
     <w:nsid w:val="6D09375E"/>
     <w:multiLevelType w:val="multilevel"/>
     <w:tmpl w:val="A7284770"/>
@@ -11842,7 +13772,7 @@
       </w:pPr>
     </w:lvl>
   </w:abstractNum>
-  <w:abstractNum w:abstractNumId="36" w15:restartNumberingAfterBreak="0">
+  <w:abstractNum w:abstractNumId="41" w15:restartNumberingAfterBreak="0">
     <w:nsid w:val="70FC3E54"/>
     <w:multiLevelType w:val="multilevel"/>
     <w:tmpl w:val="ADDEBE68"/>
@@ -11955,7 +13885,7 @@
       </w:pPr>
     </w:lvl>
   </w:abstractNum>
-  <w:abstractNum w:abstractNumId="37" w15:restartNumberingAfterBreak="0">
+  <w:abstractNum w:abstractNumId="42" w15:restartNumberingAfterBreak="0">
     <w:nsid w:val="72E80AAF"/>
     <w:multiLevelType w:val="multilevel"/>
     <w:tmpl w:val="248EB58A"/>
@@ -12104,7 +14034,156 @@
       </w:rPr>
     </w:lvl>
   </w:abstractNum>
-  <w:abstractNum w:abstractNumId="38" w15:restartNumberingAfterBreak="0">
+  <w:abstractNum w:abstractNumId="43" w15:restartNumberingAfterBreak="0">
+    <w:nsid w:val="734E3BA7"/>
+    <w:multiLevelType w:val="multilevel"/>
+    <w:tmpl w:val="853E1AC4"/>
+    <w:lvl w:ilvl="0">
+      <w:start w:val="1"/>
+      <w:numFmt w:val="bullet"/>
+      <w:lvlText w:val=""/>
+      <w:lvlJc w:val="left"/>
+      <w:pPr>
+        <w:tabs>
+          <w:tab w:val="num" w:pos="720"/>
+        </w:tabs>
+        <w:ind w:left="720" w:hanging="360"/>
+      </w:pPr>
+      <w:rPr>
+        <w:rFonts w:ascii="Symbol" w:hAnsi="Symbol" w:hint="default"/>
+        <w:sz w:val="20"/>
+      </w:rPr>
+    </w:lvl>
+    <w:lvl w:ilvl="1">
+      <w:start w:val="1"/>
+      <w:numFmt w:val="bullet"/>
+      <w:lvlText w:val="o"/>
+      <w:lvlJc w:val="left"/>
+      <w:pPr>
+        <w:tabs>
+          <w:tab w:val="num" w:pos="1440"/>
+        </w:tabs>
+        <w:ind w:left="1440" w:hanging="360"/>
+      </w:pPr>
+      <w:rPr>
+        <w:rFonts w:ascii="Courier New" w:hAnsi="Courier New" w:hint="default"/>
+        <w:sz w:val="20"/>
+      </w:rPr>
+    </w:lvl>
+    <w:lvl w:ilvl="2" w:tentative="1">
+      <w:start w:val="1"/>
+      <w:numFmt w:val="bullet"/>
+      <w:lvlText w:val=""/>
+      <w:lvlJc w:val="left"/>
+      <w:pPr>
+        <w:tabs>
+          <w:tab w:val="num" w:pos="2160"/>
+        </w:tabs>
+        <w:ind w:left="2160" w:hanging="360"/>
+      </w:pPr>
+      <w:rPr>
+        <w:rFonts w:ascii="Wingdings" w:hAnsi="Wingdings" w:hint="default"/>
+        <w:sz w:val="20"/>
+      </w:rPr>
+    </w:lvl>
+    <w:lvl w:ilvl="3" w:tentative="1">
+      <w:start w:val="1"/>
+      <w:numFmt w:val="bullet"/>
+      <w:lvlText w:val=""/>
+      <w:lvlJc w:val="left"/>
+      <w:pPr>
+        <w:tabs>
+          <w:tab w:val="num" w:pos="2880"/>
+        </w:tabs>
+        <w:ind w:left="2880" w:hanging="360"/>
+      </w:pPr>
+      <w:rPr>
+        <w:rFonts w:ascii="Wingdings" w:hAnsi="Wingdings" w:hint="default"/>
+        <w:sz w:val="20"/>
+      </w:rPr>
+    </w:lvl>
+    <w:lvl w:ilvl="4" w:tentative="1">
+      <w:start w:val="1"/>
+      <w:numFmt w:val="bullet"/>
+      <w:lvlText w:val=""/>
+      <w:lvlJc w:val="left"/>
+      <w:pPr>
+        <w:tabs>
+          <w:tab w:val="num" w:pos="3600"/>
+        </w:tabs>
+        <w:ind w:left="3600" w:hanging="360"/>
+      </w:pPr>
+      <w:rPr>
+        <w:rFonts w:ascii="Wingdings" w:hAnsi="Wingdings" w:hint="default"/>
+        <w:sz w:val="20"/>
+      </w:rPr>
+    </w:lvl>
+    <w:lvl w:ilvl="5" w:tentative="1">
+      <w:start w:val="1"/>
+      <w:numFmt w:val="bullet"/>
+      <w:lvlText w:val=""/>
+      <w:lvlJc w:val="left"/>
+      <w:pPr>
+        <w:tabs>
+          <w:tab w:val="num" w:pos="4320"/>
+        </w:tabs>
+        <w:ind w:left="4320" w:hanging="360"/>
+      </w:pPr>
+      <w:rPr>
+        <w:rFonts w:ascii="Wingdings" w:hAnsi="Wingdings" w:hint="default"/>
+        <w:sz w:val="20"/>
+      </w:rPr>
+    </w:lvl>
+    <w:lvl w:ilvl="6" w:tentative="1">
+      <w:start w:val="1"/>
+      <w:numFmt w:val="bullet"/>
+      <w:lvlText w:val=""/>
+      <w:lvlJc w:val="left"/>
+      <w:pPr>
+        <w:tabs>
+          <w:tab w:val="num" w:pos="5040"/>
+        </w:tabs>
+        <w:ind w:left="5040" w:hanging="360"/>
+      </w:pPr>
+      <w:rPr>
+        <w:rFonts w:ascii="Wingdings" w:hAnsi="Wingdings" w:hint="default"/>
+        <w:sz w:val="20"/>
+      </w:rPr>
+    </w:lvl>
+    <w:lvl w:ilvl="7" w:tentative="1">
+      <w:start w:val="1"/>
+      <w:numFmt w:val="bullet"/>
+      <w:lvlText w:val=""/>
+      <w:lvlJc w:val="left"/>
+      <w:pPr>
+        <w:tabs>
+          <w:tab w:val="num" w:pos="5760"/>
+        </w:tabs>
+        <w:ind w:left="5760" w:hanging="360"/>
+      </w:pPr>
+      <w:rPr>
+        <w:rFonts w:ascii="Wingdings" w:hAnsi="Wingdings" w:hint="default"/>
+        <w:sz w:val="20"/>
+      </w:rPr>
+    </w:lvl>
+    <w:lvl w:ilvl="8" w:tentative="1">
+      <w:start w:val="1"/>
+      <w:numFmt w:val="bullet"/>
+      <w:lvlText w:val=""/>
+      <w:lvlJc w:val="left"/>
+      <w:pPr>
+        <w:tabs>
+          <w:tab w:val="num" w:pos="6480"/>
+        </w:tabs>
+        <w:ind w:left="6480" w:hanging="360"/>
+      </w:pPr>
+      <w:rPr>
+        <w:rFonts w:ascii="Wingdings" w:hAnsi="Wingdings" w:hint="default"/>
+        <w:sz w:val="20"/>
+      </w:rPr>
+    </w:lvl>
+  </w:abstractNum>
+  <w:abstractNum w:abstractNumId="44" w15:restartNumberingAfterBreak="0">
     <w:nsid w:val="75C853D8"/>
     <w:multiLevelType w:val="multilevel"/>
     <w:tmpl w:val="9EBAD16E"/>
@@ -12217,7 +14296,7 @@
       </w:pPr>
     </w:lvl>
   </w:abstractNum>
-  <w:abstractNum w:abstractNumId="39" w15:restartNumberingAfterBreak="0">
+  <w:abstractNum w:abstractNumId="45" w15:restartNumberingAfterBreak="0">
     <w:nsid w:val="773D3B83"/>
     <w:multiLevelType w:val="multilevel"/>
     <w:tmpl w:val="828A7878"/>
@@ -12366,7 +14445,7 @@
       </w:rPr>
     </w:lvl>
   </w:abstractNum>
-  <w:abstractNum w:abstractNumId="40" w15:restartNumberingAfterBreak="0">
+  <w:abstractNum w:abstractNumId="46" w15:restartNumberingAfterBreak="0">
     <w:nsid w:val="77955D70"/>
     <w:multiLevelType w:val="multilevel"/>
     <w:tmpl w:val="9D6CB71E"/>
@@ -12516,73 +14595,73 @@
     </w:lvl>
   </w:abstractNum>
   <w:num w:numId="1" w16cid:durableId="1171678626">
-    <w:abstractNumId w:val="34"/>
+    <w:abstractNumId w:val="39"/>
   </w:num>
   <w:num w:numId="2" w16cid:durableId="32001159">
-    <w:abstractNumId w:val="18"/>
+    <w:abstractNumId w:val="20"/>
   </w:num>
   <w:num w:numId="3" w16cid:durableId="906842992">
-    <w:abstractNumId w:val="24"/>
+    <w:abstractNumId w:val="27"/>
   </w:num>
   <w:num w:numId="4" w16cid:durableId="1485119291">
+    <w:abstractNumId w:val="21"/>
+  </w:num>
+  <w:num w:numId="5" w16cid:durableId="1511145568">
+    <w:abstractNumId w:val="17"/>
+  </w:num>
+  <w:num w:numId="6" w16cid:durableId="19791915">
+    <w:abstractNumId w:val="32"/>
+  </w:num>
+  <w:num w:numId="7" w16cid:durableId="1461681454">
     <w:abstractNumId w:val="19"/>
   </w:num>
-  <w:num w:numId="5" w16cid:durableId="1511145568">
-    <w:abstractNumId w:val="16"/>
-  </w:num>
-  <w:num w:numId="6" w16cid:durableId="19791915">
-    <w:abstractNumId w:val="28"/>
-  </w:num>
-  <w:num w:numId="7" w16cid:durableId="1461681454">
-    <w:abstractNumId w:val="17"/>
-  </w:num>
   <w:num w:numId="8" w16cid:durableId="1290624472">
-    <w:abstractNumId w:val="8"/>
+    <w:abstractNumId w:val="9"/>
   </w:num>
   <w:num w:numId="9" w16cid:durableId="346904817">
-    <w:abstractNumId w:val="39"/>
+    <w:abstractNumId w:val="45"/>
   </w:num>
   <w:num w:numId="10" w16cid:durableId="559899731">
-    <w:abstractNumId w:val="36"/>
+    <w:abstractNumId w:val="41"/>
   </w:num>
   <w:num w:numId="11" w16cid:durableId="512038484">
-    <w:abstractNumId w:val="14"/>
+    <w:abstractNumId w:val="15"/>
   </w:num>
   <w:num w:numId="12" w16cid:durableId="1234699364">
-    <w:abstractNumId w:val="20"/>
+    <w:abstractNumId w:val="23"/>
   </w:num>
   <w:num w:numId="13" w16cid:durableId="2020232442">
+    <w:abstractNumId w:val="42"/>
+  </w:num>
+  <w:num w:numId="14" w16cid:durableId="2131195316">
+    <w:abstractNumId w:val="33"/>
+  </w:num>
+  <w:num w:numId="15" w16cid:durableId="1303077134">
     <w:abstractNumId w:val="37"/>
   </w:num>
-  <w:num w:numId="14" w16cid:durableId="2131195316">
-    <w:abstractNumId w:val="29"/>
-  </w:num>
-  <w:num w:numId="15" w16cid:durableId="1303077134">
-    <w:abstractNumId w:val="33"/>
-  </w:num>
   <w:num w:numId="16" w16cid:durableId="2124688839">
-    <w:abstractNumId w:val="4"/>
+    <w:abstractNumId w:val="5"/>
   </w:num>
   <w:num w:numId="17" w16cid:durableId="1364281767">
-    <w:abstractNumId w:val="40"/>
+    <w:abstractNumId w:val="46"/>
   </w:num>
   <w:num w:numId="18" w16cid:durableId="1615791304">
-    <w:abstractNumId w:val="21"/>
+    <w:abstractNumId w:val="24"/>
   </w:num>
   <w:num w:numId="19" w16cid:durableId="3284960">
     <w:abstractNumId w:val="3"/>
   </w:num>
   <w:num w:numId="20" w16cid:durableId="531891974">
-    <w:abstractNumId w:val="6"/>
+    <w:abstractNumId w:val="7"/>
   </w:num>
   <w:num w:numId="21" w16cid:durableId="1363701848">
     <w:abstractNumId w:val="2"/>
   </w:num>
   <w:num w:numId="22" w16cid:durableId="2010714934">
-    <w:abstractNumId w:val="7"/>
+    <w:abstractNumId w:val="8"/>
   </w:num>
   <w:num w:numId="23" w16cid:durableId="215701080">
-    <w:abstractNumId w:val="10"/>
+    <w:abstractNumId w:val="11"/>
   </w:num>
   <w:num w:numId="24" w16cid:durableId="1097940099">
     <w:abstractNumId w:val="0"/>
@@ -12591,52 +14670,70 @@
     <w:abstractNumId w:val="1"/>
   </w:num>
   <w:num w:numId="26" w16cid:durableId="328682289">
-    <w:abstractNumId w:val="9"/>
+    <w:abstractNumId w:val="10"/>
   </w:num>
   <w:num w:numId="27" w16cid:durableId="401408353">
+    <w:abstractNumId w:val="13"/>
+  </w:num>
+  <w:num w:numId="28" w16cid:durableId="851184768">
+    <w:abstractNumId w:val="30"/>
+  </w:num>
+  <w:num w:numId="29" w16cid:durableId="1888250470">
+    <w:abstractNumId w:val="6"/>
+  </w:num>
+  <w:num w:numId="30" w16cid:durableId="887181575">
+    <w:abstractNumId w:val="34"/>
+  </w:num>
+  <w:num w:numId="31" w16cid:durableId="1122503102">
+    <w:abstractNumId w:val="14"/>
+  </w:num>
+  <w:num w:numId="32" w16cid:durableId="1155027113">
+    <w:abstractNumId w:val="31"/>
+  </w:num>
+  <w:num w:numId="33" w16cid:durableId="33426180">
+    <w:abstractNumId w:val="35"/>
+  </w:num>
+  <w:num w:numId="34" w16cid:durableId="1347560598">
+    <w:abstractNumId w:val="25"/>
+  </w:num>
+  <w:num w:numId="35" w16cid:durableId="230123646">
+    <w:abstractNumId w:val="29"/>
+  </w:num>
+  <w:num w:numId="36" w16cid:durableId="2026663206">
+    <w:abstractNumId w:val="40"/>
+  </w:num>
+  <w:num w:numId="37" w16cid:durableId="1906793969">
+    <w:abstractNumId w:val="36"/>
+  </w:num>
+  <w:num w:numId="38" w16cid:durableId="377314903">
+    <w:abstractNumId w:val="16"/>
+  </w:num>
+  <w:num w:numId="39" w16cid:durableId="182937367">
+    <w:abstractNumId w:val="44"/>
+  </w:num>
+  <w:num w:numId="40" w16cid:durableId="2088070933">
     <w:abstractNumId w:val="12"/>
   </w:num>
-  <w:num w:numId="28" w16cid:durableId="851184768">
+  <w:num w:numId="41" w16cid:durableId="1351957386">
     <w:abstractNumId w:val="26"/>
   </w:num>
-  <w:num w:numId="29" w16cid:durableId="1888250470">
-    <w:abstractNumId w:val="5"/>
+  <w:num w:numId="42" w16cid:durableId="1297104737">
+    <w:abstractNumId w:val="38"/>
   </w:num>
-  <w:num w:numId="30" w16cid:durableId="887181575">
-    <w:abstractNumId w:val="30"/>
+  <w:num w:numId="43" w16cid:durableId="42995835">
+    <w:abstractNumId w:val="28"/>
   </w:num>
-  <w:num w:numId="31" w16cid:durableId="1122503102">
-    <w:abstractNumId w:val="13"/>
+  <w:num w:numId="44" w16cid:durableId="1788281711">
+    <w:abstractNumId w:val="4"/>
   </w:num>
-  <w:num w:numId="32" w16cid:durableId="1155027113">
-    <w:abstractNumId w:val="27"/>
-  </w:num>
-  <w:num w:numId="33" w16cid:durableId="33426180">
-    <w:abstractNumId w:val="31"/>
-  </w:num>
-  <w:num w:numId="34" w16cid:durableId="1347560598">
+  <w:num w:numId="45" w16cid:durableId="215626465">
     <w:abstractNumId w:val="22"/>
   </w:num>
-  <w:num w:numId="35" w16cid:durableId="230123646">
-    <w:abstractNumId w:val="25"/>
+  <w:num w:numId="46" w16cid:durableId="859666140">
+    <w:abstractNumId w:val="18"/>
   </w:num>
-  <w:num w:numId="36" w16cid:durableId="2026663206">
-    <w:abstractNumId w:val="35"/>
-  </w:num>
-  <w:num w:numId="37" w16cid:durableId="1906793969">
-    <w:abstractNumId w:val="32"/>
-  </w:num>
-  <w:num w:numId="38" w16cid:durableId="377314903">
-    <w:abstractNumId w:val="15"/>
-  </w:num>
-  <w:num w:numId="39" w16cid:durableId="182937367">
-    <w:abstractNumId w:val="38"/>
-  </w:num>
-  <w:num w:numId="40" w16cid:durableId="2088070933">
-    <w:abstractNumId w:val="11"/>
-  </w:num>
-  <w:num w:numId="41" w16cid:durableId="1351957386">
-    <w:abstractNumId w:val="23"/>
+  <w:num w:numId="47" w16cid:durableId="625888733">
+    <w:abstractNumId w:val="43"/>
   </w:num>
 </w:numbering>
 </file>

</xml_diff>